<commit_message>
week09: complete lab answers and add challenge.py
</commit_message>
<xml_diff>
--- a/week09/Student_Lab_answered.docx
+++ b/week09/Student_Lab_answered.docx
@@ -16,14 +16,12 @@
       </w:r>
       <w:r>
         <w:br/>
-      </w:r>
-      <w:r>
         <w:t>ใช้ Python, SQLite และ pandas วิเคราะห์ยอดขายร้านเครื่องดื่มและอาหารจากข้อมูลจำลอง แล้วตรวจว่าผลสรุปถูกต้องตาม Grain ของข้อมูล</w:t>
       </w:r>
     </w:p>
     <w:p>
       <w:r>
-        <w:t>ชื่อและรหัสนิสิต .........</w:t>
+        <w:t>ชื่อและรหัสนิสิต ...........</w:t>
       </w:r>
       <w:r>
         <w:rPr>
@@ -32,25 +30,22 @@
           <w:cs/>
           <w:lang w:bidi="th-TH"/>
         </w:rPr>
-        <w:t>ปัณณกร พลเสน</w:t>
-      </w:r>
-      <w:r>
-        <w:t>....</w:t>
-      </w:r>
-      <w:r>
-        <w:t>67160352</w:t>
-      </w:r>
-      <w:r>
-        <w:t xml:space="preserve">.......... </w:t>
-      </w:r>
-      <w:r>
-        <w:t>กลุ่มเรียน .......</w:t>
-      </w:r>
-      <w:r>
+        <w:t>นายปัณณกร พลเสน 67160352</w:t>
+      </w:r>
+      <w:r>
+        <w:t>........... กลุ่มเรียน ......</w:t>
+      </w:r>
+      <w:r>
+        <w:rPr>
+          <w:rFonts w:cstheme="minorBidi" w:hint="cs"/>
+          <w:szCs w:val="30"/>
+          <w:cs/>
+          <w:lang w:bidi="th-TH"/>
+        </w:rPr>
         <w:t>03</w:t>
       </w:r>
       <w:r>
-        <w:t>......</w:t>
+        <w:t>.......</w:t>
       </w:r>
     </w:p>
     <w:p>
@@ -490,13 +485,7 @@
               <w:rPr>
                 <w:sz w:val="20"/>
               </w:rPr>
-              <w:t xml:space="preserve">SQL </w:t>
-            </w:r>
-            <w:r>
-              <w:rPr>
-                <w:sz w:val="20"/>
-              </w:rPr>
-              <w:t>และ Python Pivot</w:t>
+              <w:t>SQL และ Python Pivot</w:t>
             </w:r>
           </w:p>
         </w:tc>
@@ -736,18 +725,12 @@
     </w:p>
     <w:p>
       <w:r>
-        <w:t xml:space="preserve">data/warehouse.db </w:t>
-      </w:r>
-      <w:r>
-        <w:t>และ warehouse.csv เป็นชุดหลัก 8 รายการตามสไลด์ หน้า 19 มี 6 ออเดอร์ในเดือนสิงหาคมและกันยายน 2026 รวม 1,390 บาท ชื่อไฟล์ CSV ใช้ warehouse.csv เพื่อให้จับคู่กับฐานข้อมูลได้ง่าย</w:t>
+        <w:t>data/warehouse.db และ warehouse.csv เป็นชุดหลัก 8 รายการตามสไลด์ หน้า 19 มี 6 ออเดอร์ในเดือนสิงหาคมและกันยายน 2026 รวม 1,390 บาท ชื่อไฟล์ CSV ใช้ warehouse.csv เพื่อให้จับคู่กับฐานข้อมูลได้ง่าย</w:t>
       </w:r>
     </w:p>
     <w:p>
       <w:r>
-        <w:t xml:space="preserve">data/extended.db </w:t>
-      </w:r>
-      <w:r>
-        <w:t>และ extended.csv เป็นชุดต่อยอด 3,649 รายการ จาก 1,800 ออเดอร์ วันที่ 1 สิงหาคมถึง 31 ตุลาคม 2026 มี 6 สินค้า 3 หมวด 6 สาขา และ 4 จังหวัด สร้างด้วย seed 9033267 ข้อมูลทั้งหมดเป็นข้อมูลจำลอง รวมถึงช่วงวันที่ในอนาคต</w:t>
+        <w:t>data/extended.db และ extended.csv เป็นชุดต่อยอด 3,649 รายการ จาก 1,800 ออเดอร์ วันที่ 1 สิงหาคมถึง 31 ตุลาคม 2026 มี 6 สินค้า 3 หมวด 6 สาขา และ 4 จังหวัด สร้างด้วย seed 9033267 ข้อมูลทั้งหมดเป็นข้อมูลจำลอง รวมถึงช่วงวันที่ในอนาคต</w:t>
       </w:r>
     </w:p>
     <w:p>
@@ -766,10 +749,7 @@
       </w:pPr>
       <w:r>
         <w:lastRenderedPageBreak/>
-        <w:t xml:space="preserve">1 </w:t>
-      </w:r>
-      <w:r>
-        <w:t>เตรียมเครื่องและทดลอง OLTP</w:t>
+        <w:t>1 เตรียมเครื่องและทดลอง OLTP</w:t>
       </w:r>
     </w:p>
     <w:p>
@@ -880,10 +860,7 @@
     </w:p>
     <w:p>
       <w:r>
-        <w:t xml:space="preserve">query.py </w:t>
-      </w:r>
-      <w:r>
-        <w:t>รับ SELECT ครั้งละหนึ่งคำสั่งและเปิดฐานข้อมูลแบบอ่านอย่างเดียว บันทึกคำตอบเป็น q01.sql, q02.sql ฯลฯ แล้วเปลี่ยนชื่อไฟล์ท้ายคำสั่งรัน ใช้ sqlite3 ใน Python สำหรับกิจกรรมที่เขียนข้อมูล</w:t>
+        <w:t>query.py รับ SELECT ครั้งละหนึ่งคำสั่งและเปิดฐานข้อมูลแบบอ่านอย่างเดียว บันทึกคำตอบเป็น q01.sql, q02.sql ฯลฯ แล้วเปลี่ยนชื่อไฟล์ท้ายคำสั่งรัน ใช้ sqlite3 ใน Python สำหรับกิจกรรมที่เขียนข้อมูล</w:t>
       </w:r>
     </w:p>
     <w:p>
@@ -925,6 +902,7 @@
           <w:sz w:val="22"/>
         </w:rPr>
         <w:br/>
+        <w:t>รอบ 1: แก้ 1 แถว — O1004 เปลี่ยนจาก PENDING → PAID</w:t>
       </w:r>
       <w:r>
         <w:rPr>
@@ -932,7 +910,8 @@
           <w:color w:val="0000B4"/>
           <w:sz w:val="22"/>
         </w:rPr>
-        <w:t>รอบ 1: แก้ 1 แถว — O1004 เปลี่ยนจาก PENDING → PAID</w:t>
+        <w:br/>
+        <w:t>รอบ 2: แก้ 0 แถว — WHERE status='PENDING' ไม่ match เพราะสถานะเป็น PAID แล้ว</w:t>
       </w:r>
       <w:r>
         <w:rPr>
@@ -941,7 +920,6 @@
           <w:sz w:val="22"/>
         </w:rPr>
         <w:br/>
-        <w:t>รอบ 2: แก้ 0 แถว — WHERE status='PENDING' ไม่ match เพราะสถานะเป็น PAID แล้ว</w:t>
       </w:r>
       <w:r>
         <w:rPr>
@@ -950,6 +928,7 @@
           <w:sz w:val="22"/>
         </w:rPr>
         <w:br/>
+        <w:t>เหตุที่ต้องมีเงื่อนไข status: ป้องกัน UPDATE ซ้ำโดยไม่ตั้งใจ ทำให้ idempotent (รันซ้ำปลอดภัย)</w:t>
       </w:r>
       <w:r>
         <w:rPr>
@@ -958,22 +937,6 @@
           <w:sz w:val="22"/>
         </w:rPr>
         <w:br/>
-        <w:t>เหตุที่ต้องมีเงื่อนไข status: ป้องกัน UPDATE ซ้ำโดยไม่ตั้งใจ ทำให้ idempotent (รันซ้ำปลอดภัย)</w:t>
-      </w:r>
-      <w:r>
-        <w:rPr>
-          <w:b/>
-          <w:color w:val="0000B4"/>
-          <w:sz w:val="22"/>
-        </w:rPr>
-        <w:br/>
-      </w:r>
-      <w:r>
-        <w:rPr>
-          <w:b/>
-          <w:color w:val="0000B4"/>
-          <w:sz w:val="22"/>
-        </w:rPr>
         <w:t>เหตุที่เป็น OLTP: ทำงาน 1 record ต่อ transaction สั้น เร็ว SELECT ใช้ตรวจสถานะเท่านั้น</w:t>
       </w:r>
       <w:r>
@@ -1013,10 +976,7 @@
         <w:pStyle w:val="Heading1"/>
       </w:pPr>
       <w:r>
-        <w:t xml:space="preserve">2 Grain </w:t>
-      </w:r>
-      <w:r>
-        <w:t>และ Star Schema</w:t>
+        <w:t>2 Grain และ Star Schema</w:t>
       </w:r>
     </w:p>
     <w:p>
@@ -1312,13 +1272,7 @@
               <w:rPr>
                 <w:sz w:val="20"/>
               </w:rPr>
-              <w:t xml:space="preserve">View </w:t>
-            </w:r>
-            <w:r>
-              <w:rPr>
-                <w:sz w:val="20"/>
-              </w:rPr>
-              <w:t>ที่ JOIN fact กับมิติ และคำนวณ amount</w:t>
+              <w:t>View ที่ JOIN fact กับมิติ และคำนวณ amount</w:t>
             </w:r>
           </w:p>
         </w:tc>
@@ -1339,35 +1293,691 @@
     </w:p>
     <w:p>
       <w:r>
-        <w:t xml:space="preserve">2.1 </w:t>
-      </w:r>
-      <w:r>
-        <w:t>วาด Star Schema ระบุ PK, FK และความสัมพันธ์ 1:N พร้อมเขียนว่า 1 แถวใน fact_sales หมายถึงอะไร ยกตัวอย่าง O1001 ที่มีหลายแถว</w:t>
+        <w:t>2.1 วาด Star Schema ระบุ PK, FK และความสัมพันธ์ 1:N พร้อมเขียนว่า 1 แถวใน fact_sales หมายถึงอะไร ยกตัวอย่าง O1001 ที่มีหลายแถว</w:t>
       </w:r>
     </w:p>
     <w:p>
       <w:r>
-        <w:t xml:space="preserve">2.2 </w:t>
-      </w:r>
-      <w:r>
-        <w:t>เขียน q01.sql แสดง line_count, order_count, units และ revenue โดยเลือก COUNT, COUNT(DISTINCT) และ SUM ให้ตรงหน่วย เปรียบเทียบกับข้อมูลจริงโดยเปิด CSV</w:t>
+        <w:rPr>
+          <w:b/>
+          <w:color w:val="0000CC"/>
+          <w:sz w:val="20"/>
+        </w:rPr>
+        <w:t>Star Schema (ข้อ 2.1):</w:t>
+      </w:r>
+      <w:r>
+        <w:rPr>
+          <w:b/>
+          <w:color w:val="0000CC"/>
+          <w:sz w:val="20"/>
+        </w:rPr>
+        <w:br/>
+      </w:r>
+      <w:r>
+        <w:rPr>
+          <w:b/>
+          <w:color w:val="0000CC"/>
+          <w:sz w:val="20"/>
+        </w:rPr>
+        <w:br/>
+        <w:t xml:space="preserve">               dim_date                  </w:t>
+      </w:r>
+      <w:r>
+        <w:rPr>
+          <w:b/>
+          <w:color w:val="0000CC"/>
+          <w:sz w:val="20"/>
+        </w:rPr>
+        <w:t xml:space="preserve">                           </w:t>
+      </w:r>
+      <w:r>
+        <w:rPr>
+          <w:b/>
+          <w:color w:val="0000CC"/>
+          <w:sz w:val="20"/>
+        </w:rPr>
+        <w:t xml:space="preserve">  dim_product              </w:t>
+      </w:r>
+      <w:r>
+        <w:rPr>
+          <w:b/>
+          <w:color w:val="0000CC"/>
+          <w:sz w:val="20"/>
+        </w:rPr>
+        <w:t xml:space="preserve">         </w:t>
+      </w:r>
+      <w:r>
+        <w:rPr>
+          <w:b/>
+          <w:color w:val="0000CC"/>
+          <w:sz w:val="20"/>
+        </w:rPr>
+        <w:t>dim_store</w:t>
+      </w:r>
+      <w:r>
+        <w:rPr>
+          <w:b/>
+          <w:color w:val="0000CC"/>
+          <w:sz w:val="20"/>
+        </w:rPr>
+        <w:br/>
+        <w:t xml:space="preserve">         ┌──────────────┐           ┌──────────────┐       ┌──────────────┐</w:t>
+      </w:r>
+      <w:r>
+        <w:rPr>
+          <w:b/>
+          <w:color w:val="0000CC"/>
+          <w:sz w:val="20"/>
+        </w:rPr>
+        <w:br/>
+        <w:t xml:space="preserve">         │ date_key (PK)</w:t>
+      </w:r>
+      <w:r>
+        <w:rPr>
+          <w:b/>
+          <w:color w:val="0000CC"/>
+          <w:sz w:val="20"/>
+        </w:rPr>
+        <w:t xml:space="preserve">            </w:t>
+      </w:r>
+      <w:r>
+        <w:rPr>
+          <w:b/>
+          <w:color w:val="0000CC"/>
+          <w:sz w:val="20"/>
+        </w:rPr>
+        <w:t xml:space="preserve">│         </w:t>
+      </w:r>
+      <w:r>
+        <w:rPr>
+          <w:b/>
+          <w:color w:val="0000CC"/>
+          <w:sz w:val="20"/>
+        </w:rPr>
+        <w:t xml:space="preserve">  </w:t>
+      </w:r>
+      <w:r>
+        <w:rPr>
+          <w:b/>
+          <w:color w:val="0000CC"/>
+          <w:sz w:val="20"/>
+        </w:rPr>
+        <w:t>│product_key(PK</w:t>
+      </w:r>
+      <w:r>
+        <w:rPr>
+          <w:b/>
+          <w:color w:val="0000CC"/>
+          <w:sz w:val="20"/>
+        </w:rPr>
+        <w:t xml:space="preserve">        </w:t>
+      </w:r>
+      <w:r>
+        <w:rPr>
+          <w:b/>
+          <w:color w:val="0000CC"/>
+          <w:sz w:val="20"/>
+        </w:rPr>
+        <w:t>│       │store_key (PK)</w:t>
+      </w:r>
+      <w:r>
+        <w:rPr>
+          <w:b/>
+          <w:color w:val="0000CC"/>
+          <w:sz w:val="20"/>
+        </w:rPr>
+        <w:t xml:space="preserve">          </w:t>
+      </w:r>
+      <w:r>
+        <w:rPr>
+          <w:b/>
+          <w:color w:val="0000CC"/>
+          <w:sz w:val="20"/>
+        </w:rPr>
+        <w:t>│</w:t>
+      </w:r>
+      <w:r>
+        <w:rPr>
+          <w:b/>
+          <w:color w:val="0000CC"/>
+          <w:sz w:val="20"/>
+        </w:rPr>
+        <w:br/>
+        <w:t xml:space="preserve">         │ full_date    </w:t>
+      </w:r>
+      <w:r>
+        <w:rPr>
+          <w:b/>
+          <w:color w:val="0000CC"/>
+          <w:sz w:val="20"/>
+        </w:rPr>
+        <w:t xml:space="preserve">                   </w:t>
+      </w:r>
+      <w:r>
+        <w:rPr>
+          <w:b/>
+          <w:color w:val="0000CC"/>
+          <w:sz w:val="20"/>
+        </w:rPr>
+        <w:t xml:space="preserve">│          </w:t>
+      </w:r>
+      <w:r>
+        <w:rPr>
+          <w:b/>
+          <w:color w:val="0000CC"/>
+          <w:sz w:val="20"/>
+        </w:rPr>
+        <w:t xml:space="preserve"> </w:t>
+      </w:r>
+      <w:r>
+        <w:rPr>
+          <w:b/>
+          <w:color w:val="0000CC"/>
+          <w:sz w:val="20"/>
+        </w:rPr>
+        <w:t xml:space="preserve">│product_name  </w:t>
+      </w:r>
+      <w:r>
+        <w:rPr>
+          <w:b/>
+          <w:color w:val="0000CC"/>
+          <w:sz w:val="20"/>
+        </w:rPr>
+        <w:t xml:space="preserve">          </w:t>
+      </w:r>
+      <w:r>
+        <w:rPr>
+          <w:b/>
+          <w:color w:val="0000CC"/>
+          <w:sz w:val="20"/>
+        </w:rPr>
+        <w:t xml:space="preserve">│       </w:t>
+      </w:r>
+      <w:r>
+        <w:rPr>
+          <w:b/>
+          <w:color w:val="0000CC"/>
+          <w:sz w:val="20"/>
+        </w:rPr>
+        <w:t xml:space="preserve"> </w:t>
+      </w:r>
+      <w:r>
+        <w:rPr>
+          <w:b/>
+          <w:color w:val="0000CC"/>
+          <w:sz w:val="20"/>
+        </w:rPr>
+        <w:t xml:space="preserve">│store_name   </w:t>
+      </w:r>
+      <w:r>
+        <w:rPr>
+          <w:b/>
+          <w:color w:val="0000CC"/>
+          <w:sz w:val="20"/>
+        </w:rPr>
+        <w:t xml:space="preserve">        </w:t>
+      </w:r>
+      <w:r>
+        <w:rPr>
+          <w:b/>
+          <w:color w:val="0000CC"/>
+          <w:sz w:val="20"/>
+        </w:rPr>
+        <w:t xml:space="preserve"> </w:t>
+      </w:r>
+      <w:r>
+        <w:rPr>
+          <w:b/>
+          <w:color w:val="0000CC"/>
+          <w:sz w:val="20"/>
+        </w:rPr>
+        <w:t xml:space="preserve">   </w:t>
+      </w:r>
+      <w:r>
+        <w:rPr>
+          <w:b/>
+          <w:color w:val="0000CC"/>
+          <w:sz w:val="20"/>
+        </w:rPr>
+        <w:t>│</w:t>
+      </w:r>
+      <w:r>
+        <w:rPr>
+          <w:b/>
+          <w:color w:val="0000CC"/>
+          <w:sz w:val="20"/>
+        </w:rPr>
+        <w:br/>
+        <w:t xml:space="preserve">         │ month        </w:t>
+      </w:r>
+      <w:r>
+        <w:rPr>
+          <w:b/>
+          <w:color w:val="0000CC"/>
+          <w:sz w:val="20"/>
+        </w:rPr>
+        <w:t xml:space="preserve">                   </w:t>
+      </w:r>
+      <w:r>
+        <w:rPr>
+          <w:b/>
+          <w:color w:val="0000CC"/>
+          <w:sz w:val="20"/>
+        </w:rPr>
+        <w:t xml:space="preserve">│          </w:t>
+      </w:r>
+      <w:r>
+        <w:rPr>
+          <w:b/>
+          <w:color w:val="0000CC"/>
+          <w:sz w:val="20"/>
+        </w:rPr>
+        <w:t xml:space="preserve"> </w:t>
+      </w:r>
+      <w:r>
+        <w:rPr>
+          <w:b/>
+          <w:color w:val="0000CC"/>
+          <w:sz w:val="20"/>
+        </w:rPr>
+        <w:t xml:space="preserve">│category      </w:t>
+      </w:r>
+      <w:r>
+        <w:rPr>
+          <w:b/>
+          <w:color w:val="0000CC"/>
+          <w:sz w:val="20"/>
+        </w:rPr>
+        <w:t xml:space="preserve">                  </w:t>
+      </w:r>
+      <w:r>
+        <w:rPr>
+          <w:b/>
+          <w:color w:val="0000CC"/>
+          <w:sz w:val="20"/>
+        </w:rPr>
+        <w:t xml:space="preserve">│       </w:t>
+      </w:r>
+      <w:r>
+        <w:rPr>
+          <w:b/>
+          <w:color w:val="0000CC"/>
+          <w:sz w:val="20"/>
+        </w:rPr>
+        <w:t xml:space="preserve">  </w:t>
+      </w:r>
+      <w:r>
+        <w:rPr>
+          <w:b/>
+          <w:color w:val="0000CC"/>
+          <w:sz w:val="20"/>
+        </w:rPr>
+        <w:t xml:space="preserve">│province      </w:t>
+      </w:r>
+      <w:r>
+        <w:rPr>
+          <w:b/>
+          <w:color w:val="0000CC"/>
+          <w:sz w:val="20"/>
+        </w:rPr>
+        <w:t xml:space="preserve">              </w:t>
+      </w:r>
+      <w:r>
+        <w:rPr>
+          <w:b/>
+          <w:color w:val="0000CC"/>
+          <w:sz w:val="20"/>
+        </w:rPr>
+        <w:t>│</w:t>
+      </w:r>
+      <w:r>
+        <w:rPr>
+          <w:b/>
+          <w:color w:val="0000CC"/>
+          <w:sz w:val="20"/>
+        </w:rPr>
+        <w:br/>
+        <w:t xml:space="preserve">         │ year         </w:t>
+      </w:r>
+      <w:r>
+        <w:rPr>
+          <w:b/>
+          <w:color w:val="0000CC"/>
+          <w:sz w:val="20"/>
+        </w:rPr>
+        <w:t xml:space="preserve">                       </w:t>
+      </w:r>
+      <w:r>
+        <w:rPr>
+          <w:b/>
+          <w:color w:val="0000CC"/>
+          <w:sz w:val="20"/>
+        </w:rPr>
+        <w:t xml:space="preserve">│           │unit_price    </w:t>
+      </w:r>
+      <w:r>
+        <w:rPr>
+          <w:b/>
+          <w:color w:val="0000CC"/>
+          <w:sz w:val="20"/>
+        </w:rPr>
+        <w:t xml:space="preserve">                 </w:t>
+      </w:r>
+      <w:r>
+        <w:rPr>
+          <w:b/>
+          <w:color w:val="0000CC"/>
+          <w:sz w:val="20"/>
+        </w:rPr>
+        <w:t xml:space="preserve">│       </w:t>
+      </w:r>
+      <w:r>
+        <w:rPr>
+          <w:b/>
+          <w:color w:val="0000CC"/>
+          <w:sz w:val="20"/>
+        </w:rPr>
+        <w:t xml:space="preserve"> </w:t>
+      </w:r>
+      <w:r>
+        <w:rPr>
+          <w:b/>
+          <w:color w:val="0000CC"/>
+          <w:sz w:val="20"/>
+        </w:rPr>
+        <w:t xml:space="preserve">│region        </w:t>
+      </w:r>
+      <w:r>
+        <w:rPr>
+          <w:b/>
+          <w:color w:val="0000CC"/>
+          <w:sz w:val="20"/>
+        </w:rPr>
+        <w:t xml:space="preserve">                 </w:t>
+      </w:r>
+      <w:r>
+        <w:rPr>
+          <w:b/>
+          <w:color w:val="0000CC"/>
+          <w:sz w:val="20"/>
+        </w:rPr>
+        <w:t>│</w:t>
+      </w:r>
+      <w:r>
+        <w:rPr>
+          <w:b/>
+          <w:color w:val="0000CC"/>
+          <w:sz w:val="20"/>
+        </w:rPr>
+        <w:br/>
+        <w:t xml:space="preserve">         └──────┬───────┘           └──────┬───────┘       └──────┬───────┘</w:t>
+      </w:r>
+      <w:r>
+        <w:rPr>
+          <w:b/>
+          <w:color w:val="0000CC"/>
+          <w:sz w:val="20"/>
+        </w:rPr>
+        <w:br/>
+        <w:t xml:space="preserve">                │ 1:N                     </w:t>
+      </w:r>
+      <w:r>
+        <w:rPr>
+          <w:b/>
+          <w:color w:val="0000CC"/>
+          <w:sz w:val="20"/>
+        </w:rPr>
+        <w:t xml:space="preserve">                                     </w:t>
+      </w:r>
+      <w:r>
+        <w:rPr>
+          <w:b/>
+          <w:color w:val="0000CC"/>
+          <w:sz w:val="20"/>
+        </w:rPr>
+        <w:t xml:space="preserve">  </w:t>
+      </w:r>
+      <w:r>
+        <w:rPr>
+          <w:b/>
+          <w:color w:val="0000CC"/>
+          <w:sz w:val="20"/>
+        </w:rPr>
+        <w:t xml:space="preserve">    </w:t>
+      </w:r>
+      <w:r>
+        <w:rPr>
+          <w:b/>
+          <w:color w:val="0000CC"/>
+          <w:sz w:val="20"/>
+        </w:rPr>
+        <w:t xml:space="preserve">│ 1:N                  </w:t>
+      </w:r>
+      <w:r>
+        <w:rPr>
+          <w:b/>
+          <w:color w:val="0000CC"/>
+          <w:sz w:val="20"/>
+        </w:rPr>
+        <w:t xml:space="preserve">                           </w:t>
+      </w:r>
+      <w:r>
+        <w:rPr>
+          <w:b/>
+          <w:color w:val="0000CC"/>
+          <w:sz w:val="20"/>
+        </w:rPr>
+        <w:t>│ 1:N</w:t>
+      </w:r>
+      <w:r>
+        <w:rPr>
+          <w:b/>
+          <w:color w:val="0000CC"/>
+          <w:sz w:val="20"/>
+        </w:rPr>
+        <w:br/>
+        <w:t xml:space="preserve">                └──────────────┬───────</w:t>
+      </w:r>
+      <w:r>
+        <w:rPr>
+          <w:b/>
+          <w:color w:val="0000CC"/>
+          <w:sz w:val="20"/>
+        </w:rPr>
+        <w:t>──</w:t>
+      </w:r>
+      <w:r>
+        <w:rPr>
+          <w:b/>
+          <w:color w:val="0000CC"/>
+          <w:sz w:val="20"/>
+        </w:rPr>
+        <w:t>┘───────────────────┘</w:t>
+      </w:r>
+      <w:r>
+        <w:rPr>
+          <w:b/>
+          <w:color w:val="0000CC"/>
+          <w:sz w:val="20"/>
+        </w:rPr>
+        <w:br/>
+        <w:t xml:space="preserve">                            </w:t>
+      </w:r>
+      <w:r>
+        <w:rPr>
+          <w:b/>
+          <w:color w:val="0000CC"/>
+          <w:sz w:val="20"/>
+        </w:rPr>
+        <w:t xml:space="preserve">                             </w:t>
+      </w:r>
+      <w:r>
+        <w:rPr>
+          <w:b/>
+          <w:color w:val="0000CC"/>
+          <w:sz w:val="20"/>
+        </w:rPr>
+        <w:t xml:space="preserve">   ▼</w:t>
+      </w:r>
+      <w:r>
+        <w:rPr>
+          <w:b/>
+          <w:color w:val="0000CC"/>
+          <w:sz w:val="20"/>
+        </w:rPr>
+        <w:br/>
+        <w:t xml:space="preserve">                     </w:t>
+      </w:r>
+      <w:r>
+        <w:rPr>
+          <w:b/>
+          <w:color w:val="0000CC"/>
+          <w:sz w:val="20"/>
+        </w:rPr>
+        <w:t xml:space="preserve">                            </w:t>
+      </w:r>
+      <w:r>
+        <w:rPr>
+          <w:b/>
+          <w:color w:val="0000CC"/>
+          <w:sz w:val="20"/>
+        </w:rPr>
+        <w:t xml:space="preserve">    fact_sales</w:t>
+      </w:r>
+      <w:r>
+        <w:rPr>
+          <w:b/>
+          <w:color w:val="0000CC"/>
+          <w:sz w:val="20"/>
+        </w:rPr>
+        <w:br/>
+        <w:t xml:space="preserve">                   ┌─────────────────────┐</w:t>
+      </w:r>
+      <w:r>
+        <w:rPr>
+          <w:b/>
+          <w:color w:val="0000CC"/>
+          <w:sz w:val="20"/>
+        </w:rPr>
+        <w:br/>
+        <w:t xml:space="preserve">                   │ sale_id (PK)        │</w:t>
+      </w:r>
+      <w:r>
+        <w:rPr>
+          <w:b/>
+          <w:color w:val="0000CC"/>
+          <w:sz w:val="20"/>
+        </w:rPr>
+        <w:br/>
+        <w:t xml:space="preserve">                   │ date_key  (FK→dim_date)│</w:t>
+      </w:r>
+      <w:r>
+        <w:rPr>
+          <w:b/>
+          <w:color w:val="0000CC"/>
+          <w:sz w:val="20"/>
+        </w:rPr>
+        <w:br/>
+        <w:t xml:space="preserve">                   │ product_key(FK→dim_product)│</w:t>
+      </w:r>
+      <w:r>
+        <w:rPr>
+          <w:b/>
+          <w:color w:val="0000CC"/>
+          <w:sz w:val="20"/>
+        </w:rPr>
+        <w:br/>
+        <w:t xml:space="preserve">                   │ store_key (FK→dim_store)│</w:t>
+      </w:r>
+      <w:r>
+        <w:rPr>
+          <w:b/>
+          <w:color w:val="0000CC"/>
+          <w:sz w:val="20"/>
+        </w:rPr>
+        <w:br/>
+        <w:t xml:space="preserve">                   │ order_id            │</w:t>
+      </w:r>
+      <w:r>
+        <w:rPr>
+          <w:b/>
+          <w:color w:val="0000CC"/>
+          <w:sz w:val="20"/>
+        </w:rPr>
+        <w:br/>
+        <w:t xml:space="preserve">                   │ line_no             │</w:t>
+      </w:r>
+      <w:r>
+        <w:rPr>
+          <w:b/>
+          <w:color w:val="0000CC"/>
+          <w:sz w:val="20"/>
+        </w:rPr>
+        <w:br/>
+        <w:t xml:space="preserve">                   │ quantity  ← Measure │</w:t>
+      </w:r>
+      <w:r>
+        <w:rPr>
+          <w:b/>
+          <w:color w:val="0000CC"/>
+          <w:sz w:val="20"/>
+        </w:rPr>
+        <w:br/>
+        <w:t xml:space="preserve">                   │ amount    ← Measure │</w:t>
+      </w:r>
+      <w:r>
+        <w:rPr>
+          <w:b/>
+          <w:color w:val="0000CC"/>
+          <w:sz w:val="20"/>
+        </w:rPr>
+        <w:br/>
+        <w:t xml:space="preserve">                   └─────────────────────┘</w:t>
+      </w:r>
+      <w:r>
+        <w:rPr>
+          <w:b/>
+          <w:color w:val="0000CC"/>
+          <w:sz w:val="20"/>
+        </w:rPr>
+        <w:br/>
+      </w:r>
+      <w:r>
+        <w:rPr>
+          <w:b/>
+          <w:color w:val="0000CC"/>
+          <w:sz w:val="20"/>
+        </w:rPr>
+        <w:br/>
+        <w:t>1 แถวใน fact_sales = 1 order line (สินค้า 1 รายการใน 1 ออเดอร์)</w:t>
+      </w:r>
+      <w:r>
+        <w:rPr>
+          <w:b/>
+          <w:color w:val="0000CC"/>
+          <w:sz w:val="20"/>
+        </w:rPr>
+        <w:br/>
+        <w:t>ตัวอย่าง O1001: มี 2 แถว → line1 = Tea, line2 = Cookie</w:t>
       </w:r>
     </w:p>
     <w:p>
       <w:r>
-        <w:t xml:space="preserve">2.3 </w:t>
-      </w:r>
-      <w:r>
-        <w:t>ระบุ 3 Dimensions และ 2 Measures ของระบบ เขียน Hierarchy ของเวลาและสถานที่อย่างละ 1 เส้นทาง แล้วอธิบายว่าทำไม unit_price ไม่ควรนำมาบวกเป็นยอดขาย</w:t>
+        <w:t>2.2 เขียน q01.sql แสดง line_count, order_count, units และ revenue โดยเลือก COUNT, COUNT(DISTINCT) และ SUM ให้ตรงหน่วย เปรียบเทียบกับข้อมูลจริงโดยเปิด CSV</w:t>
       </w:r>
     </w:p>
     <w:p>
       <w:r>
-        <w:t>คำใบ้: amount บวกได้ แต่ชื่อคอลัมน์ที่เป็นตัวเลขไม่ได้แปลว่าต้อง SUM ทุกตัว</w:t>
+        <w:t>2.3 ระบุ 3 Dimensions และ 2 Measures ของระบบ เขียน Hierarchy ของเวลาและสถานที่อย่างละ 1 เส้นทาง แล้วอธิบายว่าทำไม unit_price ไม่ควรนำมาบวกเป็นยอดขาย</w:t>
       </w:r>
     </w:p>
     <w:p>
       <w:r>
+        <w:t>คำใบ้: amount บวกได้ แต่ชื่อคอลัมน์ที่เป็นตัวเลขไม่ได้แปลว่าต้อง SUM ทุกตัว</w:t>
+      </w:r>
+    </w:p>
+    <w:p>
+      <w:r>
         <w:rPr>
           <w:b/>
           <w:color w:val="0000B4"/>
@@ -1382,6 +1992,7 @@
           <w:sz w:val="22"/>
         </w:rPr>
         <w:br/>
+        <w:t>จำนวนรายการ  8  จำนวนออเดอร์  6  จำนวนชิ้น  23</w:t>
       </w:r>
       <w:r>
         <w:rPr>
@@ -1389,43 +2000,27 @@
           <w:color w:val="0000B4"/>
           <w:sz w:val="22"/>
         </w:rPr>
-        <w:t>จำนวนรายการ  8  จำนวนออเดอร์  6  จำนวนชิ้น  23</w:t>
-      </w:r>
+        <w:br/>
+        <w:t>ยอดขายรวม  1,390  บาท</w:t>
+      </w:r>
+    </w:p>
+    <w:p>
       <w:r>
         <w:rPr>
           <w:b/>
           <w:color w:val="0000B4"/>
           <w:sz w:val="22"/>
         </w:rPr>
-        <w:br/>
-        <w:t>ยอดขายรวม  1,390  บาท</w:t>
-      </w:r>
-    </w:p>
-    <w:p>
+        <w:t>คำอธิบาย Grain และมิติ:</w:t>
+      </w:r>
       <w:r>
         <w:rPr>
           <w:b/>
           <w:color w:val="0000B4"/>
           <w:sz w:val="22"/>
         </w:rPr>
-        <w:t>คำอธิบาย Grain และมิติ:</w:t>
-      </w:r>
-      <w:r>
-        <w:rPr>
-          <w:b/>
-          <w:color w:val="0000B4"/>
-          <w:sz w:val="22"/>
-        </w:rPr>
-        <w:br/>
-        <w:t xml:space="preserve">Grain: 1 </w:t>
-      </w:r>
-      <w:r>
-        <w:rPr>
-          <w:b/>
-          <w:color w:val="0000B4"/>
-          <w:sz w:val="22"/>
-        </w:rPr>
-        <w:t>แถว = 1 order line ตัวอย่าง O1001 มี 2 แถว (line1=Tea, line2=Cookie)</w:t>
+        <w:br/>
+        <w:t>Grain: 1 แถว = 1 order line ตัวอย่าง O1001 มี 2 แถว (line1=Tea, line2=Cookie)</w:t>
       </w:r>
       <w:r>
         <w:rPr>
@@ -1595,13 +2190,7 @@
               <w:rPr>
                 <w:sz w:val="20"/>
               </w:rPr>
-              <w:t xml:space="preserve">Roll-up </w:t>
-            </w:r>
-            <w:r>
-              <w:rPr>
-                <w:sz w:val="20"/>
-              </w:rPr>
-              <w:t>ยอดขายรายเดือน เรียงตามเดือน</w:t>
+              <w:t>Roll-up ยอดขายรายเดือน เรียงตามเดือน</w:t>
             </w:r>
           </w:p>
         </w:tc>
@@ -1693,13 +2282,7 @@
               <w:rPr>
                 <w:sz w:val="20"/>
               </w:rPr>
-              <w:t xml:space="preserve">Drill-down </w:t>
-            </w:r>
-            <w:r>
-              <w:rPr>
-                <w:sz w:val="20"/>
-              </w:rPr>
-              <w:t>เวลา แสดงยอดรายวันเฉพาะกันยายน</w:t>
+              <w:t>Drill-down เวลา แสดงยอดรายวันเฉพาะกันยายน</w:t>
             </w:r>
           </w:p>
         </w:tc>
@@ -1745,13 +2328,7 @@
               <w:rPr>
                 <w:sz w:val="20"/>
               </w:rPr>
-              <w:t xml:space="preserve">Slice </w:t>
-            </w:r>
-            <w:r>
-              <w:rPr>
-                <w:sz w:val="20"/>
-              </w:rPr>
-              <w:t>เฉพาะกันยายน สรุปยอดรายจังหวัด</w:t>
+              <w:t>Slice เฉพาะกันยายน สรุปยอดรายจังหวัด</w:t>
             </w:r>
           </w:p>
         </w:tc>
@@ -1797,13 +2374,7 @@
               <w:rPr>
                 <w:sz w:val="20"/>
               </w:rPr>
-              <w:t xml:space="preserve">Dice </w:t>
-            </w:r>
-            <w:r>
-              <w:rPr>
-                <w:sz w:val="20"/>
-              </w:rPr>
-              <w:t>กันยายน หมวด Drink และจังหวัด Bangkok หรือ Chonburi</w:t>
+              <w:t>Dice กันยายน หมวด Drink และจังหวัด Bangkok หรือ Chonburi</w:t>
             </w:r>
           </w:p>
         </w:tc>
@@ -1895,13 +2466,7 @@
               <w:rPr>
                 <w:sz w:val="20"/>
               </w:rPr>
-              <w:t xml:space="preserve">Drill-through </w:t>
-            </w:r>
-            <w:r>
-              <w:rPr>
-                <w:sz w:val="20"/>
-              </w:rPr>
-              <w:t>แสดง order_id, line_no, product_name, quantity, amount ของ Bangkok กันยายน</w:t>
+              <w:t>Drill-through แสดง order_id, line_no, product_name, quantity, amount ของ Bangkok กันยายน</w:t>
             </w:r>
           </w:p>
         </w:tc>
@@ -1993,129 +2558,374 @@
       </w:r>
     </w:p>
     <w:p>
-      <w:pPr>
-        <w:pStyle w:val="Heading1"/>
-      </w:pPr>
-      <w:r>
-        <w:t>คำถามระหว่างทำ</w:t>
-      </w:r>
-    </w:p>
-    <w:p>
-      <w:r>
-        <w:t>ก. q03 เพิ่มมิติสถานที่ ส่วน q04 เพิ่มรายละเอียดภายในมิติเวลา ทั้งสองกรณีทำให้การอ่านผลต่างกันอย่างไร?</w:t>
-      </w:r>
-      <w:r>
-        <w:br/>
-      </w:r>
-      <w:r>
-        <w:t>ข. q07 ต้องกรองเดือนใน WHERE หรือ HAVING และยอด SUM(amount) ควรกรองตรงไหน?</w:t>
-      </w:r>
-      <w:r>
-        <w:br/>
-        <w:t>ค. เมื่อนำรายการจาก q12 มารวมกัน ควรเท่ากับช่องใดใน q03?</w:t>
-      </w:r>
-    </w:p>
-    <w:p>
-      <w:r>
-        <w:t>จุดตรวจ: ยอดรายเดือนรวมกันต้องเท่ากับยอดทั้งชุด ยอดรายวันกันยายนต้องเท่ากับผล Slice กันยายน หากไม่ตรงให้ตรวจ WHERE และ GROUP BY ก่อนสรุป</w:t>
-      </w:r>
-    </w:p>
-    <w:p>
-      <w:r>
-        <w:rPr>
-          <w:b/>
-          <w:color w:val="0000B4"/>
-          <w:sz w:val="22"/>
-        </w:rPr>
-        <w:t>คำตอบคำถาม ก. ข. ค.:</w:t>
-      </w:r>
-      <w:r>
-        <w:rPr>
-          <w:b/>
-          <w:color w:val="0000B4"/>
-          <w:sz w:val="22"/>
-        </w:rPr>
-        <w:br/>
-      </w:r>
-      <w:r>
-        <w:rPr>
-          <w:b/>
-          <w:color w:val="0000B4"/>
-          <w:sz w:val="22"/>
-        </w:rPr>
-        <w:br/>
-      </w:r>
-      <w:r>
-        <w:rPr>
-          <w:b/>
-          <w:color w:val="0000B4"/>
-          <w:sz w:val="22"/>
-        </w:rPr>
-        <w:t>ก. q03 เพิ่มจังหวัดในผลรายเดือน → อ่านเปรียบเทียบ 'เดือนไหน จังหวัดไหน ขายดี' ได้พร้อมกัน</w:t>
-      </w:r>
-      <w:r>
-        <w:rPr>
-          <w:b/>
-          <w:color w:val="0000B4"/>
-          <w:sz w:val="22"/>
-        </w:rPr>
-        <w:br/>
-        <w:t xml:space="preserve">   q04 Drill-down เวลา → อ่านยอดรายวันใน Sep เห็น trend ว่าวันไหนขายสูงสุด</w:t>
-      </w:r>
-      <w:r>
-        <w:rPr>
-          <w:b/>
-          <w:color w:val="0000B4"/>
-          <w:sz w:val="22"/>
-        </w:rPr>
-        <w:br/>
-      </w:r>
-      <w:r>
-        <w:rPr>
-          <w:b/>
-          <w:color w:val="0000B4"/>
-          <w:sz w:val="22"/>
-        </w:rPr>
-        <w:br/>
-      </w:r>
-      <w:r>
-        <w:rPr>
-          <w:b/>
-          <w:color w:val="0000B4"/>
-          <w:sz w:val="22"/>
-        </w:rPr>
-        <w:t>ข. month ต้องกรองใน WHERE (row-level ก่อน GROUP BY)  ยอด SUM(amount) ต้องกรองใน HAVING (aggregate หลัง GROUP BY)</w:t>
-      </w:r>
-      <w:r>
-        <w:rPr>
-          <w:b/>
-          <w:color w:val="0000B4"/>
-          <w:sz w:val="22"/>
-        </w:rPr>
-        <w:br/>
-      </w:r>
-      <w:r>
-        <w:rPr>
-          <w:b/>
-          <w:color w:val="0000B4"/>
-          <w:sz w:val="22"/>
-        </w:rPr>
-        <w:br/>
-        <w:t>ค. รวม q12 (Bangkok detail): 150+160+300+240 = 850 → ตรงกับ q03 ยอด Bangkok รวมทั้งปี = 850 ✓</w:t>
-      </w:r>
-      <w:r>
-        <w:rPr>
-          <w:b/>
-          <w:color w:val="0000B4"/>
-          <w:sz w:val="22"/>
-        </w:rPr>
-        <w:br/>
-        <w:t xml:space="preserve">   ยืนยัน: Aug(490)+Sep(900) = 1,390 ตรงกับ q01 revenue ✓</w:t>
-      </w:r>
-    </w:p>
-    <w:p>
-      <w:r>
-        <w:br w:type="page"/>
+      <w:r>
+        <w:rPr>
+          <w:b/>
+          <w:color w:val="0000CC"/>
+          <w:sz w:val="20"/>
+        </w:rPr>
+        <w:t>ผลรัน SQL (Section 3):</w:t>
+      </w:r>
+      <w:r>
+        <w:rPr>
+          <w:b/>
+          <w:color w:val="0000CC"/>
+          <w:sz w:val="20"/>
+        </w:rPr>
+        <w:br/>
+      </w:r>
+      <w:r>
+        <w:rPr>
+          <w:b/>
+          <w:color w:val="0000CC"/>
+          <w:sz w:val="20"/>
+        </w:rPr>
+        <w:br/>
+        <w:t>q02 Roll-up by Month:</w:t>
+      </w:r>
+      <w:r>
+        <w:rPr>
+          <w:b/>
+          <w:color w:val="0000CC"/>
+          <w:sz w:val="20"/>
+        </w:rPr>
+        <w:br/>
+        <w:t xml:space="preserve">  month      | revenue</w:t>
+      </w:r>
+      <w:r>
+        <w:rPr>
+          <w:b/>
+          <w:color w:val="0000CC"/>
+          <w:sz w:val="20"/>
+        </w:rPr>
+        <w:br/>
+        <w:t xml:space="preserve">  2026-08    |  490</w:t>
+      </w:r>
+      <w:r>
+        <w:rPr>
+          <w:b/>
+          <w:color w:val="0000CC"/>
+          <w:sz w:val="20"/>
+        </w:rPr>
+        <w:br/>
+        <w:t xml:space="preserve">  2026-09    |  900</w:t>
+      </w:r>
+      <w:r>
+        <w:rPr>
+          <w:b/>
+          <w:color w:val="0000CC"/>
+          <w:sz w:val="20"/>
+        </w:rPr>
+        <w:br/>
+      </w:r>
+      <w:r>
+        <w:rPr>
+          <w:b/>
+          <w:color w:val="0000CC"/>
+          <w:sz w:val="20"/>
+        </w:rPr>
+        <w:br/>
+        <w:t>q03 Roll-up Month + Province:</w:t>
+      </w:r>
+      <w:r>
+        <w:rPr>
+          <w:b/>
+          <w:color w:val="0000CC"/>
+          <w:sz w:val="20"/>
+        </w:rPr>
+        <w:br/>
+        <w:t xml:space="preserve">  month    | province  | revenue</w:t>
+      </w:r>
+      <w:r>
+        <w:rPr>
+          <w:b/>
+          <w:color w:val="0000CC"/>
+          <w:sz w:val="20"/>
+        </w:rPr>
+        <w:br/>
+        <w:t xml:space="preserve">  2026-08  | Bangkok   |  310</w:t>
+      </w:r>
+      <w:r>
+        <w:rPr>
+          <w:b/>
+          <w:color w:val="0000CC"/>
+          <w:sz w:val="20"/>
+        </w:rPr>
+        <w:br/>
+        <w:t xml:space="preserve">  2026-08  | Chonburi  |  180</w:t>
+      </w:r>
+      <w:r>
+        <w:rPr>
+          <w:b/>
+          <w:color w:val="0000CC"/>
+          <w:sz w:val="20"/>
+        </w:rPr>
+        <w:br/>
+        <w:t xml:space="preserve">  2026-09  | Bangkok   |  540</w:t>
+      </w:r>
+      <w:r>
+        <w:rPr>
+          <w:b/>
+          <w:color w:val="0000CC"/>
+          <w:sz w:val="20"/>
+        </w:rPr>
+        <w:br/>
+        <w:t xml:space="preserve">  2026-09  | Chonburi  |  360</w:t>
+      </w:r>
+      <w:r>
+        <w:rPr>
+          <w:b/>
+          <w:color w:val="0000CC"/>
+          <w:sz w:val="20"/>
+        </w:rPr>
+        <w:br/>
+      </w:r>
+      <w:r>
+        <w:rPr>
+          <w:b/>
+          <w:color w:val="0000CC"/>
+          <w:sz w:val="20"/>
+        </w:rPr>
+        <w:br/>
+        <w:t>q04 Drill-down วันใน Sep:</w:t>
+      </w:r>
+      <w:r>
+        <w:rPr>
+          <w:b/>
+          <w:color w:val="0000CC"/>
+          <w:sz w:val="20"/>
+        </w:rPr>
+        <w:br/>
+        <w:t xml:space="preserve">  full_date   | revenue</w:t>
+      </w:r>
+      <w:r>
+        <w:rPr>
+          <w:b/>
+          <w:color w:val="0000CC"/>
+          <w:sz w:val="20"/>
+        </w:rPr>
+        <w:br/>
+        <w:t xml:space="preserve">  2026-09-09  |  360</w:t>
+      </w:r>
+      <w:r>
+        <w:rPr>
+          <w:b/>
+          <w:color w:val="0000CC"/>
+          <w:sz w:val="20"/>
+        </w:rPr>
+        <w:br/>
+        <w:t xml:space="preserve">  2026-09-10  |  300</w:t>
+      </w:r>
+      <w:r>
+        <w:rPr>
+          <w:b/>
+          <w:color w:val="0000CC"/>
+          <w:sz w:val="20"/>
+        </w:rPr>
+        <w:br/>
+        <w:t xml:space="preserve">  2026-09-11  |  240</w:t>
+      </w:r>
+      <w:r>
+        <w:rPr>
+          <w:b/>
+          <w:color w:val="0000CC"/>
+          <w:sz w:val="20"/>
+        </w:rPr>
+        <w:br/>
+      </w:r>
+      <w:r>
+        <w:rPr>
+          <w:b/>
+          <w:color w:val="0000CC"/>
+          <w:sz w:val="20"/>
+        </w:rPr>
+        <w:br/>
+        <w:t>q05 Slice กันยายน by Province:</w:t>
+      </w:r>
+      <w:r>
+        <w:rPr>
+          <w:b/>
+          <w:color w:val="0000CC"/>
+          <w:sz w:val="20"/>
+        </w:rPr>
+        <w:br/>
+        <w:t xml:space="preserve">  province  | revenue</w:t>
+      </w:r>
+      <w:r>
+        <w:rPr>
+          <w:b/>
+          <w:color w:val="0000CC"/>
+          <w:sz w:val="20"/>
+        </w:rPr>
+        <w:br/>
+        <w:t xml:space="preserve">  Bangkok   |  540</w:t>
+      </w:r>
+      <w:r>
+        <w:rPr>
+          <w:b/>
+          <w:color w:val="0000CC"/>
+          <w:sz w:val="20"/>
+        </w:rPr>
+        <w:br/>
+        <w:t xml:space="preserve">  Chonburi  |  360</w:t>
+      </w:r>
+      <w:r>
+        <w:rPr>
+          <w:b/>
+          <w:color w:val="0000CC"/>
+          <w:sz w:val="20"/>
+        </w:rPr>
+        <w:br/>
+      </w:r>
+      <w:r>
+        <w:rPr>
+          <w:b/>
+          <w:color w:val="0000CC"/>
+          <w:sz w:val="20"/>
+        </w:rPr>
+        <w:br/>
+        <w:t>q06 Dice (Sep + Drink + BKK/Chon):</w:t>
+      </w:r>
+      <w:r>
+        <w:rPr>
+          <w:b/>
+          <w:color w:val="0000CC"/>
+          <w:sz w:val="20"/>
+        </w:rPr>
+        <w:br/>
+        <w:t xml:space="preserve">  province  | product_name | revenue</w:t>
+      </w:r>
+      <w:r>
+        <w:rPr>
+          <w:b/>
+          <w:color w:val="0000CC"/>
+          <w:sz w:val="20"/>
+        </w:rPr>
+        <w:br/>
+        <w:t xml:space="preserve">  Bangkok   | Tea          |  300</w:t>
+      </w:r>
+      <w:r>
+        <w:rPr>
+          <w:b/>
+          <w:color w:val="0000CC"/>
+          <w:sz w:val="20"/>
+        </w:rPr>
+        <w:br/>
+        <w:t xml:space="preserve">  Chonburi  | Tea          |  200</w:t>
+      </w:r>
+      <w:r>
+        <w:rPr>
+          <w:b/>
+          <w:color w:val="0000CC"/>
+          <w:sz w:val="20"/>
+        </w:rPr>
+        <w:br/>
+      </w:r>
+      <w:r>
+        <w:rPr>
+          <w:b/>
+          <w:color w:val="0000CC"/>
+          <w:sz w:val="20"/>
+        </w:rPr>
+        <w:br/>
+        <w:t>q07 HAVING &gt; 400 บาท:</w:t>
+      </w:r>
+      <w:r>
+        <w:rPr>
+          <w:b/>
+          <w:color w:val="0000CC"/>
+          <w:sz w:val="20"/>
+        </w:rPr>
+        <w:br/>
+        <w:t xml:space="preserve">  province  | revenue</w:t>
+      </w:r>
+      <w:r>
+        <w:rPr>
+          <w:b/>
+          <w:color w:val="0000CC"/>
+          <w:sz w:val="20"/>
+        </w:rPr>
+        <w:br/>
+        <w:t xml:space="preserve">  Bangkok   |  540</w:t>
+      </w:r>
+      <w:r>
+        <w:rPr>
+          <w:b/>
+          <w:color w:val="0000CC"/>
+          <w:sz w:val="20"/>
+        </w:rPr>
+        <w:br/>
+      </w:r>
+      <w:r>
+        <w:rPr>
+          <w:b/>
+          <w:color w:val="0000CC"/>
+          <w:sz w:val="20"/>
+        </w:rPr>
+        <w:br/>
+        <w:t>q12 Drill-through Bangkok:</w:t>
+      </w:r>
+      <w:r>
+        <w:rPr>
+          <w:b/>
+          <w:color w:val="0000CC"/>
+          <w:sz w:val="20"/>
+        </w:rPr>
+        <w:br/>
+        <w:t xml:space="preserve">  order_id | line_no | product_name | quantity | amount</w:t>
+      </w:r>
+      <w:r>
+        <w:rPr>
+          <w:b/>
+          <w:color w:val="0000CC"/>
+          <w:sz w:val="20"/>
+        </w:rPr>
+        <w:br/>
+        <w:t xml:space="preserve">  O1002    |   1     | Tea          |    3     |  150</w:t>
+      </w:r>
+      <w:r>
+        <w:rPr>
+          <w:b/>
+          <w:color w:val="0000CC"/>
+          <w:sz w:val="20"/>
+        </w:rPr>
+        <w:br/>
+        <w:t xml:space="preserve">  O1003    |   1     | Cookie       |    2     |  160</w:t>
+      </w:r>
+      <w:r>
+        <w:rPr>
+          <w:b/>
+          <w:color w:val="0000CC"/>
+          <w:sz w:val="20"/>
+        </w:rPr>
+        <w:br/>
+        <w:t xml:space="preserve">  O1005    |   1     | Tea          |    6     |  300</w:t>
+      </w:r>
+      <w:r>
+        <w:rPr>
+          <w:b/>
+          <w:color w:val="0000CC"/>
+          <w:sz w:val="20"/>
+        </w:rPr>
+        <w:br/>
+        <w:t xml:space="preserve">  O1006    |   1     | Cookie       |    3     |  240</w:t>
+      </w:r>
+      <w:r>
+        <w:rPr>
+          <w:b/>
+          <w:color w:val="0000CC"/>
+          <w:sz w:val="20"/>
+        </w:rPr>
+        <w:br/>
+      </w:r>
+      <w:r>
+        <w:rPr>
+          <w:b/>
+          <w:color w:val="0000CC"/>
+          <w:sz w:val="20"/>
+        </w:rPr>
+        <w:br/>
+        <w:t>Operation ที่ใช้: q02=Roll-up, q03=Roll-up+มิติสถานที่, q04=Drill-down, q05=Slice, q06=Dice, q07=HAVING filter, q12=Drill-through</w:t>
       </w:r>
     </w:p>
     <w:p>
@@ -2123,47 +2933,109 @@
         <w:pStyle w:val="Heading1"/>
       </w:pPr>
       <w:r>
-        <w:t xml:space="preserve">4 </w:t>
-      </w:r>
-      <w:r>
-        <w:t>สร้าง Pivot Table</w:t>
+        <w:t>คำถามระหว่างทำ</w:t>
       </w:r>
     </w:p>
     <w:p>
       <w:r>
-        <w:t>อ้างอิงสไลด์ 26–33 และ 36–37 ให้เติม pivot_student.py แล้วรัน python pivot_student.py</w:t>
+        <w:t>ก. q03 เพิ่มมิติสถานที่ ส่วน q04 เพิ่มรายละเอียดภายในมิติเวลา ทั้งสองกรณีทำให้การอ่านผลต่างกันอย่างไร?</w:t>
+      </w:r>
+      <w:r>
+        <w:br/>
+        <w:t>ข. q07 ต้องกรองเดือนใน WHERE หรือ HAVING และยอด SUM(amount) ควรกรองตรงไหน?</w:t>
+      </w:r>
+      <w:r>
+        <w:br/>
+        <w:t>ค. เมื่อนำรายการจาก q12 มารวมกัน ควรเท่ากับช่องใดใน q03?</w:t>
       </w:r>
     </w:p>
     <w:p>
       <w:r>
-        <w:t xml:space="preserve">4.1 </w:t>
-      </w:r>
-      <w:r>
-        <w:t>เขียน q08.sql ให้ province เป็นแถว คอลัมน์ aug, sep และ total ใช้ SUM(CASE WHEN ... THEN amount ELSE 0 END) ระบุเดือนให้ครบ</w:t>
+        <w:t>จุดตรวจ: ยอดรายเดือนรวมกันต้องเท่ากับยอดทั้งชุด ยอดรายวันกันยายนต้องเท่ากับผล Slice กันยายน หากไม่ตรงให้ตรวจ WHERE และ GROUP BY ก่อนสรุป</w:t>
       </w:r>
     </w:p>
     <w:p>
       <w:r>
-        <w:t xml:space="preserve">4.2 Python P1 </w:t>
-      </w:r>
-      <w:r>
-        <w:t>ใช้ df ทำ Pivot: index=province, columns=month, values=amount, aggfunc=sum, fill_value=0 และ margins=True ตั้ง margins_name เป็น Total บันทึก pivot_province_month.csv</w:t>
+        <w:rPr>
+          <w:b/>
+          <w:color w:val="0000B4"/>
+          <w:sz w:val="22"/>
+        </w:rPr>
+        <w:t>คำตอบคำถาม ก. ข. ค.:</w:t>
+      </w:r>
+      <w:r>
+        <w:rPr>
+          <w:b/>
+          <w:color w:val="0000B4"/>
+          <w:sz w:val="22"/>
+        </w:rPr>
+        <w:br/>
+      </w:r>
+      <w:r>
+        <w:rPr>
+          <w:b/>
+          <w:color w:val="0000B4"/>
+          <w:sz w:val="22"/>
+        </w:rPr>
+        <w:br/>
+        <w:t>ก. q03 เพิ่มจังหวัดในผลรายเดือน → อ่านเปรียบเทียบ 'เดือนไหน จังหวัดไหน ขายดี' ได้พร้อมกัน</w:t>
+      </w:r>
+      <w:r>
+        <w:rPr>
+          <w:b/>
+          <w:color w:val="0000B4"/>
+          <w:sz w:val="22"/>
+        </w:rPr>
+        <w:br/>
+        <w:t xml:space="preserve">   q04 Drill-down เวลา → อ่านยอดรายวันใน Sep เห็น trend ว่าวันไหนขายสูงสุด</w:t>
+      </w:r>
+      <w:r>
+        <w:rPr>
+          <w:b/>
+          <w:color w:val="0000B4"/>
+          <w:sz w:val="22"/>
+        </w:rPr>
+        <w:br/>
+      </w:r>
+      <w:r>
+        <w:rPr>
+          <w:b/>
+          <w:color w:val="0000B4"/>
+          <w:sz w:val="22"/>
+        </w:rPr>
+        <w:br/>
+        <w:t>ข. month ต้องกรองใน WHERE (row-level ก่อน GROUP BY)  ยอด SUM(amount) ต้องกรองใน HAVING (aggregate หลัง GROUP BY)</w:t>
+      </w:r>
+      <w:r>
+        <w:rPr>
+          <w:b/>
+          <w:color w:val="0000B4"/>
+          <w:sz w:val="22"/>
+        </w:rPr>
+        <w:br/>
+      </w:r>
+      <w:r>
+        <w:rPr>
+          <w:b/>
+          <w:color w:val="0000B4"/>
+          <w:sz w:val="22"/>
+        </w:rPr>
+        <w:br/>
+        <w:t>ค. รวม q12 (Bangkok detail): 150+160+300+240 = 850 → ตรงกับ q03 ยอด Bangkok รวมทั้งปี = 850 ✓</w:t>
+      </w:r>
+      <w:r>
+        <w:rPr>
+          <w:b/>
+          <w:color w:val="0000B4"/>
+          <w:sz w:val="22"/>
+        </w:rPr>
+        <w:br/>
+        <w:t xml:space="preserve">   ยืนยัน: Aug(490)+Sep(900) = 1,390 ตรงกับ q01 revenue ✓</w:t>
       </w:r>
     </w:p>
     <w:p>
       <w:r>
-        <w:t xml:space="preserve">4.3 Python P2 </w:t>
-      </w:r>
-      <w:r>
-        <w:t>กรองกันยายนก่อน Pivot ให้ category เป็นแถว province เป็นคอลัมน์ และรวม amount บันทึก pivot_september.csv</w:t>
-      </w:r>
-    </w:p>
-    <w:p>
-      <w:r>
-        <w:t xml:space="preserve">4.4 </w:t>
-      </w:r>
-      <w:r>
-        <w:t>เขียน assert ตรวจ Grand Total ของ P1 กับ df["amount"].sum() โดยเลือกเฉพาะเซลล์ Total × Total ห้ามรวมทุกเซลล์ของ Pivot ที่มี Total ซ้ำ</w:t>
+        <w:br w:type="page"/>
       </w:r>
     </w:p>
     <w:p>
@@ -2171,12 +3043,32 @@
         <w:pStyle w:val="Heading1"/>
       </w:pPr>
       <w:r>
-        <w:t>ทดลองข้อผิดพลาด</w:t>
+        <w:t>4 สร้าง Pivot Table</w:t>
       </w:r>
     </w:p>
     <w:p>
       <w:r>
-        <w:t>ลบ aggfunc แล้วรันใหม่ ทำไม Bangkok กันยายนจึงได้ 270? ค่า 270 แสดงอะไร แก้โค้ดคืนให้ตรงคำถามยอดขายรวม พร้อมบันทึกภาพก่อนและหลังแก้</w:t>
+        <w:t>อ้างอิงสไลด์ 26–33 และ 36–37 ให้เติม pivot_student.py แล้วรัน python pivot_student.py</w:t>
+      </w:r>
+    </w:p>
+    <w:p>
+      <w:r>
+        <w:t>4.1 เขียน q08.sql ให้ province เป็นแถว คอลัมน์ aug, sep และ total ใช้ SUM(CASE WHEN ... THEN amount ELSE 0 END) ระบุเดือนให้ครบ</w:t>
+      </w:r>
+    </w:p>
+    <w:p>
+      <w:r>
+        <w:t>4.2 Python P1 ใช้ df ทำ Pivot: index=province, columns=month, values=amount, aggfunc=sum, fill_value=0 และ margins=True ตั้ง margins_name เป็น Total บันทึก pivot_province_month.csv</w:t>
+      </w:r>
+    </w:p>
+    <w:p>
+      <w:r>
+        <w:t>4.3 Python P2 กรองกันยายนก่อน Pivot ให้ category เป็นแถว province เป็นคอลัมน์ และรวม amount บันทึก pivot_september.csv</w:t>
+      </w:r>
+    </w:p>
+    <w:p>
+      <w:r>
+        <w:t>4.4 เขียน assert ตรวจ Grand Total ของ P1 กับ df["amount"].sum() โดยเลือกเฉพาะเซลล์ Total × Total ห้ามรวมทุกเซลล์ของ Pivot ที่มี Total ซ้ำ</w:t>
       </w:r>
     </w:p>
     <w:p>
@@ -2184,78 +3076,12 @@
         <w:pStyle w:val="Heading1"/>
       </w:pPr>
       <w:r>
-        <w:t>ทดลอง Excel PivotTable</w:t>
+        <w:t>ทดลองข้อผิดพลาด</w:t>
       </w:r>
     </w:p>
     <w:p>
       <w:r>
-        <w:t>หากมี Excel ให้เปิด data/warehouse.csv เลือกข้อมูลทั้งหมดพร้อมหัวตาราง แล้ว Insert &gt; PivotTable &gt; New Worksheet จัด Rows=province, Columns=month, Values=amount และตั้งเป็น Sum เพิ่ม Filters=category แล้วเลือก Drink บันทึกไฟล์เป็น pivot.xlsx เพื่อเก็บ Pivot ไว้ CSV เก็บตัว Pivot ไม่ได้</w:t>
-      </w:r>
-    </w:p>
-    <w:p>
-      <w:r>
-        <w:t>หากไม่มี Excel ให้กรอง category == "Drink" ใน pandas แล้วทำ Pivot เดิมแทน กิจกรรมนี้ใช้เกณฑ์คะแนนเดียวกันตามผลลัพธ์และการอธิบายแกน</w:t>
-      </w:r>
-    </w:p>
-    <w:p>
-      <w:r>
-        <w:rPr>
-          <w:b/>
-          <w:color w:val="0000B4"/>
-          <w:sz w:val="22"/>
-        </w:rPr>
-        <w:t>ยอดรวมหลังกรอง Drink  750  บาท</w:t>
-      </w:r>
-      <w:r>
-        <w:rPr>
-          <w:b/>
-          <w:color w:val="0000B4"/>
-          <w:sz w:val="22"/>
-        </w:rPr>
-        <w:br/>
-      </w:r>
-      <w:r>
-        <w:rPr>
-          <w:b/>
-          <w:color w:val="0000B4"/>
-          <w:sz w:val="22"/>
-        </w:rPr>
-        <w:t>แกน Rows  province  Columns  month  Values  sum(amount)</w:t>
-      </w:r>
-      <w:r>
-        <w:rPr>
-          <w:b/>
-          <w:color w:val="0000B4"/>
-          <w:sz w:val="22"/>
-        </w:rPr>
-        <w:br/>
-      </w:r>
-      <w:r>
-        <w:rPr>
-          <w:b/>
-          <w:color w:val="0000B4"/>
-          <w:sz w:val="22"/>
-        </w:rPr>
-        <w:br/>
-        <w:t>ข้อแตกต่างของ sum กับ mean:</w:t>
-      </w:r>
-      <w:r>
-        <w:rPr>
-          <w:b/>
-          <w:color w:val="0000B4"/>
-          <w:sz w:val="22"/>
-        </w:rPr>
-        <w:br/>
-        <w:t>sum = ยอดขายรวมจริง ใช้วัด revenue ✓</w:t>
-      </w:r>
-      <w:r>
-        <w:rPr>
-          <w:b/>
-          <w:color w:val="0000B4"/>
-          <w:sz w:val="22"/>
-        </w:rPr>
-        <w:br/>
-        <w:t>mean = ค่าเฉลี่ยต่อ order line (default ของ pandas) — หากลืม aggfunc: Bangkok Sep ได้ 270 (mean ของ Tea=300, Cookie=240) แทน 540</w:t>
+        <w:t>ลบ aggfunc แล้วรันใหม่ ทำไม Bangkok กันยายนจึงได้ 270? ค่า 270 แสดงอะไร แก้โค้ดคืนให้ตรงคำถามยอดขายรวม พร้อมบันทึกภาพก่อนและหลังแก้</w:t>
       </w:r>
     </w:p>
     <w:p>
@@ -2263,22 +3089,27 @@
         <w:pStyle w:val="Heading1"/>
       </w:pPr>
       <w:r>
-        <w:t>คำถามชวนคิด</w:t>
+        <w:t>ทดลอง Excel PivotTable</w:t>
       </w:r>
     </w:p>
     <w:p>
       <w:r>
-        <w:t>หากเพิ่มเดือนตุลาคม SQL ที่เขียน CASE เฉพาะสิงหาคมและกันยายนจะแสดงคอลัมน์ใหม่เองหรือไม่ แล้ว pandas ที่ใช้ columns="month" ทำอย่างไร?</w:t>
+        <w:t>หากมี Excel ให้เปิด data/warehouse.csv เลือกข้อมูลทั้งหมดพร้อมหัวตาราง แล้ว Insert &gt; PivotTable &gt; New Worksheet จัด Rows=province, Columns=month, Values=amount และตั้งเป็น Sum เพิ่ม Filters=category แล้วเลือก Drink บันทึกไฟล์เป็น pivot.xlsx เพื่อเก็บ Pivot ไว้ CSV เก็บตัว Pivot ไม่ได้</w:t>
       </w:r>
     </w:p>
     <w:p>
       <w:r>
+        <w:t>หากไม่มี Excel ให้กรอง category == "Drink" ใน pandas แล้วทำ Pivot เดิมแทน กิจกรรมนี้ใช้เกณฑ์คะแนนเดียวกันตามผลลัพธ์และการอธิบายแกน</w:t>
+      </w:r>
+    </w:p>
+    <w:p>
+      <w:r>
         <w:rPr>
           <w:b/>
           <w:color w:val="0000B4"/>
           <w:sz w:val="22"/>
         </w:rPr>
-        <w:t>คำตอบ: SQL CASE เฉพาะ aug/sep ไม่แสดงคอลัมน์ Oct อัตโนมัติ — ต้องเพิ่ม CASE WHEN month='2026-10' ด้วยตนเอง</w:t>
+        <w:t>ยอดรวมหลังกรอง Drink  750  บาท</w:t>
       </w:r>
       <w:r>
         <w:rPr>
@@ -2287,7 +3118,7 @@
           <w:sz w:val="22"/>
         </w:rPr>
         <w:br/>
-        <w:t xml:space="preserve">pandas </w:t>
+        <w:t>แกน Rows  province  Columns  month  Values  sum(amount)</w:t>
       </w:r>
       <w:r>
         <w:rPr>
@@ -2295,12 +3126,34 @@
           <w:color w:val="0000B4"/>
           <w:sz w:val="22"/>
         </w:rPr>
-        <w:t>ที่ใช้ columns='month' สร้างคอลัมน์ Oct อัตโนมัติ เพราะดึงค่า unique ของ month จาก data จริงทุกครั้งที่รัน</w:t>
-      </w:r>
-    </w:p>
-    <w:p>
-      <w:r>
-        <w:br w:type="page"/>
+        <w:br/>
+      </w:r>
+      <w:r>
+        <w:rPr>
+          <w:b/>
+          <w:color w:val="0000B4"/>
+          <w:sz w:val="22"/>
+        </w:rPr>
+        <w:br/>
+        <w:t>ข้อแตกต่างของ sum กับ mean:</w:t>
+      </w:r>
+      <w:r>
+        <w:rPr>
+          <w:b/>
+          <w:color w:val="0000B4"/>
+          <w:sz w:val="22"/>
+        </w:rPr>
+        <w:br/>
+        <w:t>sum = ยอดขายรวมจริง ใช้วัด revenue ✓</w:t>
+      </w:r>
+      <w:r>
+        <w:rPr>
+          <w:b/>
+          <w:color w:val="0000B4"/>
+          <w:sz w:val="22"/>
+        </w:rPr>
+        <w:br/>
+        <w:t>mean = ค่าเฉลี่ยต่อ order line (default ของ pandas) — หากลืม aggfunc: Bangkok Sep ได้ 270 (mean ของ Tea=300, Cookie=240) แทน 540</w:t>
       </w:r>
     </w:p>
     <w:p>
@@ -2308,245 +3161,36 @@
         <w:pStyle w:val="Heading1"/>
       </w:pPr>
       <w:r>
-        <w:t xml:space="preserve">5 </w:t>
-      </w:r>
-      <w:r>
-        <w:t>ตรวจความถูกต้องและส่งงาน</w:t>
+        <w:t>คำถามชวนคิด</w:t>
       </w:r>
     </w:p>
     <w:p>
       <w:r>
-        <w:t>อ้างอิงสไลด์ 28 และ 34–39</w:t>
+        <w:t>หากเพิ่มเดือนตุลาคม SQL ที่เขียน CASE เฉพาะสิงหาคมและกันยายนจะแสดงคอลัมน์ใหม่เองหรือไม่ แล้ว pandas ที่ใช้ columns="month" ทำอย่างไร?</w:t>
       </w:r>
     </w:p>
     <w:p>
       <w:r>
-        <w:t xml:space="preserve">5.1 </w:t>
-      </w:r>
-      <w:r>
-        <w:t>เขียน q09.sql ใช้ UNION ALL แสดงยอดรายเดือนและแถว ALL อธิบายว่าการนำทุกแถวกลับมาบวกอีกครั้งทำให้เกิดอะไร</w:t>
+        <w:rPr>
+          <w:b/>
+          <w:color w:val="0000B4"/>
+          <w:sz w:val="22"/>
+        </w:rPr>
+        <w:t>คำตอบ: SQL CASE เฉพาะ aug/sep ไม่แสดงคอลัมน์ Oct อัตโนมัติ — ต้องเพิ่ม CASE WHEN month='2026-10' ด้วยตนเอง</w:t>
+      </w:r>
+      <w:r>
+        <w:rPr>
+          <w:b/>
+          <w:color w:val="0000B4"/>
+          <w:sz w:val="22"/>
+        </w:rPr>
+        <w:br/>
+        <w:t>pandas ที่ใช้ columns='month' สร้างคอลัมน์ Oct อัตโนมัติ เพราะดึงค่า unique ของ month จาก data จริงทุกครั้งที่รัน</w:t>
       </w:r>
     </w:p>
     <w:p>
       <w:r>
-        <w:t xml:space="preserve">5.2 </w:t>
-      </w:r>
-      <w:r>
-        <w:t>เขียน q10.sql แสดง revenue, orders, aov และ avg_line ใช้ AOV = SUM(amount) / COUNT(DISTINCT order_id) ปัด 2 ตำแหน่ง และทำให้เป็นการหารทศนิยมใน SQLite อธิบายหน่วยของ AOV เทียบกับ AVG(amount)</w:t>
-      </w:r>
-    </w:p>
-    <w:p>
-      <w:r>
-        <w:t xml:space="preserve">5.3 </w:t>
-      </w:r>
-      <w:r>
-        <w:t>เขียน q11.sql เทียบทั้งจำนวนแถวและยอดรวมก่อน JOIN จาก fact_sales กับหลัง JOIN จาก sales จากนั้นตรวจ PRAGMA foreign_key_check; อธิบายว่าคีย์ซ้ำในมิติหรือ FK ที่หายไปกระทบยอดอย่างไร</w:t>
-      </w:r>
-    </w:p>
-    <w:p>
-      <w:r>
-        <w:t xml:space="preserve">5.4 </w:t>
-      </w:r>
-      <w:r>
-        <w:t>ยกตัวอย่าง Additive, Semi-additive และ Non-additive อย่างละหนึ่งตัว พร้อมวิธีรวมที่เหมาะสม โดยเฉพาะสต็อกสิ้นวันและ AOV ข้ามเดือน</w:t>
-      </w:r>
-    </w:p>
-    <w:p>
-      <w:r>
-        <w:rPr>
-          <w:b/>
-          <w:color w:val="0000B4"/>
-          <w:sz w:val="22"/>
-        </w:rPr>
-        <w:t>คำตอบ Section 5:</w:t>
-      </w:r>
-      <w:r>
-        <w:rPr>
-          <w:b/>
-          <w:color w:val="0000B4"/>
-          <w:sz w:val="22"/>
-        </w:rPr>
-        <w:br/>
-      </w:r>
-      <w:r>
-        <w:rPr>
-          <w:b/>
-          <w:color w:val="0000B4"/>
-          <w:sz w:val="22"/>
-        </w:rPr>
-        <w:br/>
-        <w:t xml:space="preserve">q09 UNION ALL:  2026-08 → 490 </w:t>
-      </w:r>
-      <w:r>
-        <w:rPr>
-          <w:b/>
-          <w:color w:val="0000B4"/>
-          <w:sz w:val="22"/>
-        </w:rPr>
-        <w:t>บาท | 2026-09 → 900 บาท | ALL → 1,390 บาท</w:t>
-      </w:r>
-      <w:r>
-        <w:rPr>
-          <w:b/>
-          <w:color w:val="0000B4"/>
-          <w:sz w:val="22"/>
-        </w:rPr>
-        <w:br/>
-        <w:t>หากนำทุกแถวบวกกัน: 490+900+1390 = 2,780 → double-count เพราะแถว ALL ซ้ำ ใช้ ALL เพื่อ checksum เท่านั้น</w:t>
-      </w:r>
-      <w:r>
-        <w:rPr>
-          <w:b/>
-          <w:color w:val="0000B4"/>
-          <w:sz w:val="22"/>
-        </w:rPr>
-        <w:br/>
-      </w:r>
-      <w:r>
-        <w:rPr>
-          <w:b/>
-          <w:color w:val="0000B4"/>
-          <w:sz w:val="22"/>
-        </w:rPr>
-        <w:br/>
-        <w:t>q10:  revenue=1,390 | orders=6 | aov=231.67 | avg_line=173.75</w:t>
-      </w:r>
-      <w:r>
-        <w:rPr>
-          <w:b/>
-          <w:color w:val="0000B4"/>
-          <w:sz w:val="22"/>
-        </w:rPr>
-        <w:br/>
-        <w:t>AOV (231.67 บาท/order) ≠ avg_line (173.75 บาท/line) เพราะ 1 order มีหลาย line</w:t>
-      </w:r>
-      <w:r>
-        <w:rPr>
-          <w:b/>
-          <w:color w:val="0000B4"/>
-          <w:sz w:val="22"/>
-        </w:rPr>
-        <w:br/>
-      </w:r>
-      <w:r>
-        <w:rPr>
-          <w:b/>
-          <w:color w:val="0000B4"/>
-          <w:sz w:val="22"/>
-        </w:rPr>
-        <w:t>ต้องคูณ *1.0 เพื่อบังคับ SQLite ให้หารเป็นทศนิยม (integer division ให้ 231 ไม่ใช่ 231.67)</w:t>
-      </w:r>
-      <w:r>
-        <w:rPr>
-          <w:b/>
-          <w:color w:val="0000B4"/>
-          <w:sz w:val="22"/>
-        </w:rPr>
-        <w:br/>
-      </w:r>
-      <w:r>
-        <w:rPr>
-          <w:b/>
-          <w:color w:val="0000B4"/>
-          <w:sz w:val="22"/>
-        </w:rPr>
-        <w:br/>
-        <w:t>q11:  fact_rows=8 | view_rows=8 | fact_revenue=1,390 | view_revenue=1,390</w:t>
-      </w:r>
-      <w:r>
-        <w:rPr>
-          <w:b/>
-          <w:color w:val="0000B4"/>
-          <w:sz w:val="22"/>
-        </w:rPr>
-        <w:br/>
-        <w:t>PRAGMA foreign_key_check: ไม่มีผล = ไม่มี FK violation ✓</w:t>
-      </w:r>
-      <w:r>
-        <w:rPr>
-          <w:b/>
-          <w:color w:val="0000B4"/>
-          <w:sz w:val="22"/>
-        </w:rPr>
-        <w:br/>
-        <w:t>FK หาย → INNER JOIN ทำแถวหาย → view_rows &lt; fact_rows, ยอดขาด</w:t>
-      </w:r>
-      <w:r>
-        <w:rPr>
-          <w:b/>
-          <w:color w:val="0000B4"/>
-          <w:sz w:val="22"/>
-        </w:rPr>
-        <w:br/>
-        <w:t>PK ซ้ำในมิติ → JOIN พอง → view_rows &gt; fact_rows, ยอดบวม</w:t>
-      </w:r>
-      <w:r>
-        <w:rPr>
-          <w:b/>
-          <w:color w:val="0000B4"/>
-          <w:sz w:val="22"/>
-        </w:rPr>
-        <w:br/>
-      </w:r>
-      <w:r>
-        <w:rPr>
-          <w:b/>
-          <w:color w:val="0000B4"/>
-          <w:sz w:val="22"/>
-        </w:rPr>
-        <w:br/>
-        <w:t>5.4 Measure types:</w:t>
-      </w:r>
-      <w:r>
-        <w:rPr>
-          <w:b/>
-          <w:color w:val="0000B4"/>
-          <w:sz w:val="22"/>
-        </w:rPr>
-        <w:br/>
-        <w:t>Additive: amount, quantity → SUM ได้ทุกมิติ</w:t>
-      </w:r>
-      <w:r>
-        <w:rPr>
-          <w:b/>
-          <w:color w:val="0000B4"/>
-          <w:sz w:val="22"/>
-        </w:rPr>
-        <w:br/>
-        <w:t>Semi-additive: unit_price, สต็อกสิ้นวัน → SUM ตามสินค้าได้ แต่ข้ามเวลาไม่ได้ ใช้ AVG หรือ snapshot ล่าสุด</w:t>
-      </w:r>
-      <w:r>
-        <w:rPr>
-          <w:b/>
-          <w:color w:val="0000B4"/>
-          <w:sz w:val="22"/>
-        </w:rPr>
-        <w:br/>
-      </w:r>
-      <w:r>
-        <w:rPr>
-          <w:b/>
-          <w:color w:val="0000B4"/>
-          <w:sz w:val="22"/>
-        </w:rPr>
-        <w:t xml:space="preserve">Non-additive: AOV, </w:t>
-      </w:r>
-      <w:r>
-        <w:rPr>
-          <w:b/>
-          <w:color w:val="0000B4"/>
-          <w:sz w:val="22"/>
-        </w:rPr>
-        <w:t>อัตราส่วน → ห้าม SUM คำนวณใหม่จาก SUM/COUNT เสมอ</w:t>
-      </w:r>
-      <w:r>
-        <w:rPr>
-          <w:b/>
-          <w:color w:val="0000B4"/>
-          <w:sz w:val="22"/>
-        </w:rPr>
-        <w:br/>
-        <w:t>AOV ข้ามเดือน: = SUM(amount_รวม) / COUNT(DISTINCT order_id_รวม) ไม่ใช่ AVG(AOV_รายเดือน)</w:t>
+        <w:br w:type="page"/>
       </w:r>
     </w:p>
     <w:p>
@@ -2554,17 +3198,200 @@
         <w:pStyle w:val="Heading1"/>
       </w:pPr>
       <w:r>
-        <w:t>สิ่งที่ส่ง</w:t>
+        <w:t>5 ตรวจความถูกต้องและส่งงาน</w:t>
       </w:r>
     </w:p>
     <w:p>
       <w:r>
-        <w:t>ส่ง ZIP ชื่อ student_id_olap_lab.zip ภายในมี q01.sql–q12.sql, oltp_demo.py, pivot_student.py, ผลรันแต่ละข้อ, Pivot CSV หรือ XLSX และรายงานคำตอบ 2–4 หน้า รวม Star Schema และภาพหลักฐาน ไม่ต้องส่ง .venv หรือฐานข้อมูลต้นฉบับ</w:t>
+        <w:t>อ้างอิงสไลด์ 28 และ 34–39</w:t>
       </w:r>
     </w:p>
     <w:p>
       <w:r>
-        <w:t>รายงานให้ตอบคำถามในแต่ละกิจกรรม สรุปข้อค้นพบจากข้อมูลอย่างน้อย 2 ข้อและข้อจำกัด 1 ข้อ หากใช้ AI แนบ prompt สำคัญ พร้อมอธิบายหนึ่งจุดที่ตรวจแก้ด้วยตนเอง การอ้างว่ายอดเพิ่มเพราะโปร 9.9 ต้องมีหลักฐานมากกว่าตารางยอดขาย</w:t>
+        <w:t>5.1 เขียน q09.sql ใช้ UNION ALL แสดงยอดรายเดือนและแถว ALL อธิบายว่าการนำทุกแถวกลับมาบวกอีกครั้งทำให้เกิดอะไร</w:t>
+      </w:r>
+    </w:p>
+    <w:p>
+      <w:r>
+        <w:t>5.2 เขียน q10.sql แสดง revenue, orders, aov และ avg_line ใช้ AOV = SUM(amount) / COUNT(DISTINCT order_id) ปัด 2 ตำแหน่ง และทำให้เป็นการหารทศนิยมใน SQLite อธิบายหน่วยของ AOV เทียบกับ AVG(amount)</w:t>
+      </w:r>
+    </w:p>
+    <w:p>
+      <w:r>
+        <w:t>5.3 เขียน q11.sql เทียบทั้งจำนวนแถวและยอดรวมก่อน JOIN จาก fact_sales กับหลัง JOIN จาก sales จากนั้นตรวจ PRAGMA foreign_key_check; อธิบายว่าคีย์ซ้ำในมิติหรือ FK ที่หายไปกระทบยอดอย่างไร</w:t>
+      </w:r>
+    </w:p>
+    <w:p>
+      <w:r>
+        <w:t>5.4 ยกตัวอย่าง Additive, Semi-additive และ Non-additive อย่างละหนึ่งตัว พร้อมวิธีรวมที่เหมาะสม โดยเฉพาะสต็อกสิ้นวันและ AOV ข้ามเดือน</w:t>
+      </w:r>
+    </w:p>
+    <w:p>
+      <w:r>
+        <w:rPr>
+          <w:b/>
+          <w:color w:val="0000B4"/>
+          <w:sz w:val="22"/>
+        </w:rPr>
+        <w:t>คำตอบ Section 5:</w:t>
+      </w:r>
+      <w:r>
+        <w:rPr>
+          <w:b/>
+          <w:color w:val="0000B4"/>
+          <w:sz w:val="22"/>
+        </w:rPr>
+        <w:br/>
+      </w:r>
+      <w:r>
+        <w:rPr>
+          <w:b/>
+          <w:color w:val="0000B4"/>
+          <w:sz w:val="22"/>
+        </w:rPr>
+        <w:br/>
+        <w:t>q09 UNION ALL:  2026-08 → 490 บาท | 2026-09 → 900 บาท | ALL → 1,390 บาท</w:t>
+      </w:r>
+      <w:r>
+        <w:rPr>
+          <w:b/>
+          <w:color w:val="0000B4"/>
+          <w:sz w:val="22"/>
+        </w:rPr>
+        <w:br/>
+        <w:t>หากนำทุกแถวบวกกัน: 490+900+1390 = 2,780 → double-count เพราะแถว ALL ซ้ำ ใช้ ALL เพื่อ checksum เท่านั้น</w:t>
+      </w:r>
+      <w:r>
+        <w:rPr>
+          <w:b/>
+          <w:color w:val="0000B4"/>
+          <w:sz w:val="22"/>
+        </w:rPr>
+        <w:br/>
+      </w:r>
+      <w:r>
+        <w:rPr>
+          <w:b/>
+          <w:color w:val="0000B4"/>
+          <w:sz w:val="22"/>
+        </w:rPr>
+        <w:br/>
+        <w:t>q10:  revenue=1,390 | orders=6 | aov=231.67 | avg_line=173.75</w:t>
+      </w:r>
+      <w:r>
+        <w:rPr>
+          <w:b/>
+          <w:color w:val="0000B4"/>
+          <w:sz w:val="22"/>
+        </w:rPr>
+        <w:br/>
+        <w:t>AOV (231.67 บาท/order) ≠ avg_line (173.75 บาท/line) เพราะ 1 order มีหลาย line</w:t>
+      </w:r>
+      <w:r>
+        <w:rPr>
+          <w:b/>
+          <w:color w:val="0000B4"/>
+          <w:sz w:val="22"/>
+        </w:rPr>
+        <w:br/>
+        <w:t>ต้องคูณ *1.0 เพื่อบังคับ SQLite ให้หารเป็นทศนิยม (integer division ให้ 231 ไม่ใช่ 231.67)</w:t>
+      </w:r>
+      <w:r>
+        <w:rPr>
+          <w:b/>
+          <w:color w:val="0000B4"/>
+          <w:sz w:val="22"/>
+        </w:rPr>
+        <w:br/>
+      </w:r>
+      <w:r>
+        <w:rPr>
+          <w:b/>
+          <w:color w:val="0000B4"/>
+          <w:sz w:val="22"/>
+        </w:rPr>
+        <w:br/>
+        <w:t>q11:  fact_rows=8 | view_rows=8 | fact_revenue=1,390 | view_revenue=1,390</w:t>
+      </w:r>
+      <w:r>
+        <w:rPr>
+          <w:b/>
+          <w:color w:val="0000B4"/>
+          <w:sz w:val="22"/>
+        </w:rPr>
+        <w:br/>
+        <w:t>PRAGMA foreign_key_check: ไม่มีผล = ไม่มี FK violation ✓</w:t>
+      </w:r>
+      <w:r>
+        <w:rPr>
+          <w:b/>
+          <w:color w:val="0000B4"/>
+          <w:sz w:val="22"/>
+        </w:rPr>
+        <w:br/>
+        <w:t>FK หาย → INNER JOIN ทำแถวหาย → view_rows &lt; fact_rows, ยอดขาด</w:t>
+      </w:r>
+      <w:r>
+        <w:rPr>
+          <w:b/>
+          <w:color w:val="0000B4"/>
+          <w:sz w:val="22"/>
+        </w:rPr>
+        <w:br/>
+        <w:t>PK ซ้ำในมิติ → JOIN พอง → view_rows &gt; fact_rows, ยอดบวม</w:t>
+      </w:r>
+      <w:r>
+        <w:rPr>
+          <w:b/>
+          <w:color w:val="0000B4"/>
+          <w:sz w:val="22"/>
+        </w:rPr>
+        <w:br/>
+      </w:r>
+      <w:r>
+        <w:rPr>
+          <w:b/>
+          <w:color w:val="0000B4"/>
+          <w:sz w:val="22"/>
+        </w:rPr>
+        <w:br/>
+        <w:t>5.4 Measure types:</w:t>
+      </w:r>
+      <w:r>
+        <w:rPr>
+          <w:b/>
+          <w:color w:val="0000B4"/>
+          <w:sz w:val="22"/>
+        </w:rPr>
+        <w:br/>
+        <w:t>Additive: amount, quantity → SUM ได้ทุกมิติ</w:t>
+      </w:r>
+      <w:r>
+        <w:rPr>
+          <w:b/>
+          <w:color w:val="0000B4"/>
+          <w:sz w:val="22"/>
+        </w:rPr>
+        <w:br/>
+        <w:t>Semi-additive: unit_price, สต็อกสิ้นวัน → SUM ตามสินค้าได้ แต่ข้ามเวลาไม่ได้ ใช้ AVG หรือ snapshot ล่าสุด</w:t>
+      </w:r>
+      <w:r>
+        <w:rPr>
+          <w:b/>
+          <w:color w:val="0000B4"/>
+          <w:sz w:val="22"/>
+        </w:rPr>
+        <w:br/>
+        <w:t>Non-additive: AOV, อัตราส่วน → ห้าม SUM คำนวณใหม่จาก SUM/COUNT เสมอ</w:t>
+      </w:r>
+      <w:r>
+        <w:rPr>
+          <w:b/>
+          <w:color w:val="0000B4"/>
+          <w:sz w:val="22"/>
+        </w:rPr>
+        <w:br/>
+        <w:t>AOV ข้ามเดือน: = SUM(amount_รวม) / COUNT(DISTINCT order_id_รวม) ไม่ใช่ AVG(AOV_รายเดือน)</w:t>
       </w:r>
     </w:p>
     <w:p>
@@ -2572,27 +3399,459 @@
         <w:pStyle w:val="Heading1"/>
       </w:pPr>
       <w:r>
-        <w:t>โจทย์ต่อยอดนอกเวลา 30 นาที</w:t>
+        <w:t>สิ่งที่ส่ง</w:t>
       </w:r>
     </w:p>
     <w:p>
       <w:r>
-        <w:t>ก. ใช้ extended.db หา 3 สาขาที่มียอดสูงสุด และ AOV รายเดือน เขียน Query เอง เปรียบเทียบ AOV ทั้งช่วงกับค่าเฉลี่ยของ AOV รายเดือน อธิบายว่าจำนวนออเดอร์มีผลอย่างไร</w:t>
+        <w:t>ส่ง ZIP ชื่อ student_id_olap_lab.zip ภายในมี q01.sql–q12.sql, oltp_demo.py, pivot_student.py, ผลรันแต่ละข้อ, Pivot CSV หรือ XLSX และรายงานคำตอบ 2–4 หน้า รวม Star Schema และภาพหลักฐาน ไม่ต้องส่ง .venv หรือฐานข้อมูลต้นฉบับ</w:t>
       </w:r>
     </w:p>
     <w:p>
       <w:r>
-        <w:t>ข. สำเนา warehouse.db เป็น challenge.db เพิ่ม dim_date ของ 2026-10-01 และรายการ O1007/1: Tea 3 ชิ้นที่ Chonburi; O1007/2: Cookie 2 ชิ้นที่ Chonburi; O1008/1: Tea 4 ชิ้นที่ Bangkok ใช้ราคาเดิม แล้วสร้าง Pivot ใหม่ ตรวจจำนวนแถว ออเดอร์ และยอดรวมก่อนหลัง JOIN</w:t>
+        <w:t>รายงานให้ตอบคำถามในแต่ละกิจกรรม สรุปข้อค้นพบจากข้อมูลอย่างน้อย 2 ข้อและข้อจำกัด 1 ข้อ หากใช้ AI แนบ prompt สำคัญ พร้อมอธิบายหนึ่งจุดที่ตรวจแก้ด้วยตนเอง การอ้างว่ายอดเพิ่มเพราะโปร 9.9 ต้องมีหลักฐานมากกว่าตารางยอดขาย</w:t>
       </w:r>
     </w:p>
     <w:p>
-      <w:r>
-        <w:t>ใช้ product_key 1=Tea, 2=Cookie; store_key 1=Bangsaen, 2=Siam เปิด PRAGMA foreign_keys=ON ก่อน INSERT และ COMMIT เมื่อสำเร็จ ส่ง challenge.py หรือ SQL ที่เพิ่มข้อมูลด้วย</w:t>
+      <w:pPr>
+        <w:pStyle w:val="Heading1"/>
+      </w:pPr>
+      <w:r>
+        <w:t>โจทย์ต่อยอดนอกเวลา 30 นาที</w:t>
       </w:r>
     </w:p>
     <w:p>
       <w:r>
+        <w:t>ก. ใช้ extended.db หา 3 สาขาที่มียอดสูงสุด และ AOV รายเดือน เขียน Query เอง เปรียบเทียบ AOV ทั้งช่วงกับค่าเฉลี่ยของ AOV รายเดือน อธิบายว่าจำนวนออเดอร์มีผลอย่างไร</w:t>
+      </w:r>
+    </w:p>
+    <w:p>
+      <w:r>
+        <w:t>ข. สำเนา warehouse.db เป็น challenge.db เพิ่ม dim_date ของ 2026-10-01 และรายการ O1007/1: Tea 3 ชิ้นที่ Chonburi; O1007/2: Cookie 2 ชิ้นที่ Chonburi; O1008/1: Tea 4 ชิ้นที่ Bangkok ใช้ราคาเดิม แล้วสร้าง Pivot ใหม่ ตรวจจำนวนแถว ออเดอร์ และยอดรวมก่อนหลัง JOIN</w:t>
+      </w:r>
+    </w:p>
+    <w:p>
+      <w:r>
+        <w:t>ใช้ product_key 1=Tea, 2=Cookie; store_key 1=Bangsaen, 2=Siam เปิด PRAGMA foreign_keys=ON ก่อน INSERT และ COMMIT เมื่อสำเร็จ ส่ง challenge.py หรือ SQL ที่เพิ่มข้อมูลด้วย</w:t>
+      </w:r>
+    </w:p>
+    <w:p>
+      <w:r>
         <w:t>เกณฑ์ต่อยอดเป็นคะแนนเสริมได้ตามผู้สอน และไม่นับรวมคะแนนหลัก 100 คะแนน</w:t>
+      </w:r>
+    </w:p>
+    <w:p>
+      <w:r>
+        <w:rPr>
+          <w:b/>
+          <w:color w:val="0000CC"/>
+          <w:sz w:val="20"/>
+        </w:rPr>
+        <w:t>คำตอบโจทย์ต่อยอด:</w:t>
+      </w:r>
+      <w:r>
+        <w:rPr>
+          <w:b/>
+          <w:color w:val="0000CC"/>
+          <w:sz w:val="20"/>
+        </w:rPr>
+        <w:br/>
+      </w:r>
+      <w:r>
+        <w:rPr>
+          <w:b/>
+          <w:color w:val="0000CC"/>
+          <w:sz w:val="20"/>
+        </w:rPr>
+        <w:br/>
+        <w:t>━━━━ ก. extended.db — Top-3 สาขา และ AOV ━━━━</w:t>
+      </w:r>
+      <w:r>
+        <w:rPr>
+          <w:b/>
+          <w:color w:val="0000CC"/>
+          <w:sz w:val="20"/>
+        </w:rPr>
+        <w:br/>
+      </w:r>
+      <w:r>
+        <w:rPr>
+          <w:b/>
+          <w:color w:val="0000CC"/>
+          <w:sz w:val="20"/>
+        </w:rPr>
+        <w:br/>
+        <w:t>Top-3 สาขายอดรวมสูงสุด (3,649 รายการ, 1,800 orders):</w:t>
+      </w:r>
+      <w:r>
+        <w:rPr>
+          <w:b/>
+          <w:color w:val="0000CC"/>
+          <w:sz w:val="20"/>
+        </w:rPr>
+        <w:br/>
+        <w:t xml:space="preserve">  1. Nimman    (Chiang Mai)  revenue=145,280  orders=317  AOV=458.30 บาท</w:t>
+      </w:r>
+      <w:r>
+        <w:rPr>
+          <w:b/>
+          <w:color w:val="0000CC"/>
+          <w:sz w:val="20"/>
+        </w:rPr>
+        <w:br/>
+        <w:t xml:space="preserve">  2. Pattaya   (Chonburi)    revenue=141,215  orders=319  AOV=442.68 บาท</w:t>
+      </w:r>
+      <w:r>
+        <w:rPr>
+          <w:b/>
+          <w:color w:val="0000CC"/>
+          <w:sz w:val="20"/>
+        </w:rPr>
+        <w:br/>
+        <w:t xml:space="preserve">  3. Muang Rayong (Rayong)   revenue=136,710  orders=293  AOV=466.59 บาท</w:t>
+      </w:r>
+      <w:r>
+        <w:rPr>
+          <w:b/>
+          <w:color w:val="0000CC"/>
+          <w:sz w:val="20"/>
+        </w:rPr>
+        <w:br/>
+      </w:r>
+      <w:r>
+        <w:rPr>
+          <w:b/>
+          <w:color w:val="0000CC"/>
+          <w:sz w:val="20"/>
+        </w:rPr>
+        <w:br/>
+        <w:t>AOV รายเดือน (3 สาขา top):</w:t>
+      </w:r>
+      <w:r>
+        <w:rPr>
+          <w:b/>
+          <w:color w:val="0000CC"/>
+          <w:sz w:val="20"/>
+        </w:rPr>
+        <w:br/>
+        <w:t xml:space="preserve">  สาขา         | Aug-26  | Sep-26  | Oct-26</w:t>
+      </w:r>
+      <w:r>
+        <w:rPr>
+          <w:b/>
+          <w:color w:val="0000CC"/>
+          <w:sz w:val="20"/>
+        </w:rPr>
+        <w:br/>
+        <w:t xml:space="preserve">  Nimman       | 466.75  | 484.05  | 416.74</w:t>
+      </w:r>
+      <w:r>
+        <w:rPr>
+          <w:b/>
+          <w:color w:val="0000CC"/>
+          <w:sz w:val="20"/>
+        </w:rPr>
+        <w:br/>
+        <w:t xml:space="preserve">  Pattaya      | 451.61  | 450.04  | 428.58</w:t>
+      </w:r>
+      <w:r>
+        <w:rPr>
+          <w:b/>
+          <w:color w:val="0000CC"/>
+          <w:sz w:val="20"/>
+        </w:rPr>
+        <w:br/>
+        <w:t xml:space="preserve">  Muang Rayong | 461.72  | 455.36  | 483.16</w:t>
+      </w:r>
+      <w:r>
+        <w:rPr>
+          <w:b/>
+          <w:color w:val="0000CC"/>
+          <w:sz w:val="20"/>
+        </w:rPr>
+        <w:br/>
+      </w:r>
+      <w:r>
+        <w:rPr>
+          <w:b/>
+          <w:color w:val="0000CC"/>
+          <w:sz w:val="20"/>
+        </w:rPr>
+        <w:br/>
+        <w:t>เปรียบเทียบ Overall AOV กับ avg(AOV รายเดือน):</w:t>
+      </w:r>
+      <w:r>
+        <w:rPr>
+          <w:b/>
+          <w:color w:val="0000CC"/>
+          <w:sz w:val="20"/>
+        </w:rPr>
+        <w:br/>
+        <w:t xml:space="preserve">  สาขา         | overall_aov | avg_monthly_aov | diff</w:t>
+      </w:r>
+      <w:r>
+        <w:rPr>
+          <w:b/>
+          <w:color w:val="0000CC"/>
+          <w:sz w:val="20"/>
+        </w:rPr>
+        <w:br/>
+        <w:t xml:space="preserve">  Muang Rayong |   466.59    |    466.75        | -0.16</w:t>
+      </w:r>
+      <w:r>
+        <w:rPr>
+          <w:b/>
+          <w:color w:val="0000CC"/>
+          <w:sz w:val="20"/>
+        </w:rPr>
+        <w:br/>
+        <w:t xml:space="preserve">  Nimman       |   458.30    |    455.85        | +2.45</w:t>
+      </w:r>
+      <w:r>
+        <w:rPr>
+          <w:b/>
+          <w:color w:val="0000CC"/>
+          <w:sz w:val="20"/>
+        </w:rPr>
+        <w:br/>
+        <w:t xml:space="preserve">  Pattaya      |   442.68    |    443.41        | -0.73</w:t>
+      </w:r>
+      <w:r>
+        <w:rPr>
+          <w:b/>
+          <w:color w:val="0000CC"/>
+          <w:sz w:val="20"/>
+        </w:rPr>
+        <w:br/>
+      </w:r>
+      <w:r>
+        <w:rPr>
+          <w:b/>
+          <w:color w:val="0000CC"/>
+          <w:sz w:val="20"/>
+        </w:rPr>
+        <w:br/>
+        <w:t>อธิบาย: overall_aov ≠ avg(monthly_aov) เพราะน้ำหนักของแต่ละเดือนต่างกัน</w:t>
+      </w:r>
+      <w:r>
+        <w:rPr>
+          <w:b/>
+          <w:color w:val="0000CC"/>
+          <w:sz w:val="20"/>
+        </w:rPr>
+        <w:br/>
+        <w:t>เดือนที่มี orders มากกว่าจะดึง overall_aov ไปหาค่าของตัวเอง</w:t>
+      </w:r>
+      <w:r>
+        <w:rPr>
+          <w:b/>
+          <w:color w:val="0000CC"/>
+          <w:sz w:val="20"/>
+        </w:rPr>
+        <w:br/>
+        <w:t>ตัวอย่าง Nimman: Oct มี 92 orders (น้อย, AOV=416.74) → ดึง overall ลง</w:t>
+      </w:r>
+      <w:r>
+        <w:rPr>
+          <w:b/>
+          <w:color w:val="0000CC"/>
+          <w:sz w:val="20"/>
+        </w:rPr>
+        <w:br/>
+        <w:t>ทำให้ overall_aov (458.30) &gt; avg_monthly (455.85)</w:t>
+      </w:r>
+      <w:r>
+        <w:rPr>
+          <w:b/>
+          <w:color w:val="0000CC"/>
+          <w:sz w:val="20"/>
+        </w:rPr>
+        <w:br/>
+      </w:r>
+      <w:r>
+        <w:rPr>
+          <w:b/>
+          <w:color w:val="0000CC"/>
+          <w:sz w:val="20"/>
+        </w:rPr>
+        <w:br/>
+        <w:t>━━━━ ข. challenge.db — INSERT ตุลาคม + Pivot ━━━━</w:t>
+      </w:r>
+      <w:r>
+        <w:rPr>
+          <w:b/>
+          <w:color w:val="0000CC"/>
+          <w:sz w:val="20"/>
+        </w:rPr>
+        <w:br/>
+      </w:r>
+      <w:r>
+        <w:rPr>
+          <w:b/>
+          <w:color w:val="0000CC"/>
+          <w:sz w:val="20"/>
+        </w:rPr>
+        <w:br/>
+        <w:t>ก่อน INSERT:  rows=8,  orders=6,  units=23,  revenue=1,390 บาท</w:t>
+      </w:r>
+      <w:r>
+        <w:rPr>
+          <w:b/>
+          <w:color w:val="0000CC"/>
+          <w:sz w:val="20"/>
+        </w:rPr>
+        <w:br/>
+        <w:t>หลัง INSERT:  rows=11, orders=8,  units=32,  revenue=1,900 บาท</w:t>
+      </w:r>
+      <w:r>
+        <w:rPr>
+          <w:b/>
+          <w:color w:val="0000CC"/>
+          <w:sz w:val="20"/>
+        </w:rPr>
+        <w:br/>
+        <w:t>เพิ่ม:        +3 rows, +2 orders, +9 units,  +510 บาท</w:t>
+      </w:r>
+      <w:r>
+        <w:rPr>
+          <w:b/>
+          <w:color w:val="0000CC"/>
+          <w:sz w:val="20"/>
+        </w:rPr>
+        <w:br/>
+      </w:r>
+      <w:r>
+        <w:rPr>
+          <w:b/>
+          <w:color w:val="0000CC"/>
+          <w:sz w:val="20"/>
+        </w:rPr>
+        <w:br/>
+        <w:t>รายการที่เพิ่ม (2026-10-01):</w:t>
+      </w:r>
+      <w:r>
+        <w:rPr>
+          <w:b/>
+          <w:color w:val="0000CC"/>
+          <w:sz w:val="20"/>
+        </w:rPr>
+        <w:br/>
+        <w:t xml:space="preserve">  O1007/1: Tea   3 ชิ้น × 50 = 150  บาท  @ Bangsaen (Chonburi)</w:t>
+      </w:r>
+      <w:r>
+        <w:rPr>
+          <w:b/>
+          <w:color w:val="0000CC"/>
+          <w:sz w:val="20"/>
+        </w:rPr>
+        <w:br/>
+        <w:t xml:space="preserve">  O1007/2: Cookie 2 ชิ้น × 80 = 160 บาท  @ Bangsaen (Chonburi)</w:t>
+      </w:r>
+      <w:r>
+        <w:rPr>
+          <w:b/>
+          <w:color w:val="0000CC"/>
+          <w:sz w:val="20"/>
+        </w:rPr>
+        <w:br/>
+        <w:t xml:space="preserve">  O1008/1: Tea   4 ชิ้น × 50 = 200  บาท  @ Siam (Bangkok)</w:t>
+      </w:r>
+      <w:r>
+        <w:rPr>
+          <w:b/>
+          <w:color w:val="0000CC"/>
+          <w:sz w:val="20"/>
+        </w:rPr>
+        <w:br/>
+        <w:t xml:space="preserve">  รวม Chonburi Oct = 310 | Bangkok Oct = 200</w:t>
+      </w:r>
+      <w:r>
+        <w:rPr>
+          <w:b/>
+          <w:color w:val="0000CC"/>
+          <w:sz w:val="20"/>
+        </w:rPr>
+        <w:br/>
+      </w:r>
+      <w:r>
+        <w:rPr>
+          <w:b/>
+          <w:color w:val="0000CC"/>
+          <w:sz w:val="20"/>
+        </w:rPr>
+        <w:br/>
+        <w:t>Pivot Province × Month (หลังเพิ่มตุลาคม):</w:t>
+      </w:r>
+      <w:r>
+        <w:rPr>
+          <w:b/>
+          <w:color w:val="0000CC"/>
+          <w:sz w:val="20"/>
+        </w:rPr>
+        <w:br/>
+        <w:t xml:space="preserve">  province  | 2026-08 | 2026-09 | 2026-10 | Total</w:t>
+      </w:r>
+      <w:r>
+        <w:rPr>
+          <w:b/>
+          <w:color w:val="0000CC"/>
+          <w:sz w:val="20"/>
+        </w:rPr>
+        <w:br/>
+        <w:t xml:space="preserve">  Bangkok   |   310   |   540   |   200   | 1,050</w:t>
+      </w:r>
+      <w:r>
+        <w:rPr>
+          <w:b/>
+          <w:color w:val="0000CC"/>
+          <w:sz w:val="20"/>
+        </w:rPr>
+        <w:br/>
+        <w:t xml:space="preserve">  Chonburi  |   180   |   360   |   310   |   850</w:t>
+      </w:r>
+      <w:r>
+        <w:rPr>
+          <w:b/>
+          <w:color w:val="0000CC"/>
+          <w:sz w:val="20"/>
+        </w:rPr>
+        <w:br/>
+        <w:t xml:space="preserve">  Total     |   490   |   900   |   510   | 1,900</w:t>
+      </w:r>
+      <w:r>
+        <w:rPr>
+          <w:b/>
+          <w:color w:val="0000CC"/>
+          <w:sz w:val="20"/>
+        </w:rPr>
+        <w:br/>
+      </w:r>
+      <w:r>
+        <w:rPr>
+          <w:b/>
+          <w:color w:val="0000CC"/>
+          <w:sz w:val="20"/>
+        </w:rPr>
+        <w:br/>
+        <w:t>ตรวจ JOIN: fact_rows=11 = view_rows=11 ✓  |  revenue ตรงกัน ✓</w:t>
+      </w:r>
+      <w:r>
+        <w:rPr>
+          <w:b/>
+          <w:color w:val="0000CC"/>
+          <w:sz w:val="20"/>
+        </w:rPr>
+        <w:br/>
+        <w:t>PRAGMA foreign_key_check: OK — ไม่มี FK violation ✓</w:t>
+      </w:r>
+      <w:r>
+        <w:rPr>
+          <w:b/>
+          <w:color w:val="0000CC"/>
+          <w:sz w:val="20"/>
+        </w:rPr>
+        <w:br/>
+        <w:t>ไฟล์: challenge.py (INSERT + Pivot + FK check ครบ)</w:t>
       </w:r>
     </w:p>
     <w:sectPr>
@@ -2778,31 +4037,31 @@
       </w:rPr>
     </w:lvl>
   </w:abstractNum>
-  <w:num w:numId="1" w16cid:durableId="630981030">
+  <w:num w:numId="1" w16cid:durableId="353775463">
     <w:abstractNumId w:val="8"/>
   </w:num>
-  <w:num w:numId="2" w16cid:durableId="1798453008">
+  <w:num w:numId="2" w16cid:durableId="805119864">
     <w:abstractNumId w:val="6"/>
   </w:num>
-  <w:num w:numId="3" w16cid:durableId="835152480">
+  <w:num w:numId="3" w16cid:durableId="1297182219">
     <w:abstractNumId w:val="5"/>
   </w:num>
-  <w:num w:numId="4" w16cid:durableId="232619269">
+  <w:num w:numId="4" w16cid:durableId="1321806977">
     <w:abstractNumId w:val="4"/>
   </w:num>
-  <w:num w:numId="5" w16cid:durableId="1289044683">
+  <w:num w:numId="5" w16cid:durableId="754281152">
     <w:abstractNumId w:val="7"/>
   </w:num>
-  <w:num w:numId="6" w16cid:durableId="907108505">
+  <w:num w:numId="6" w16cid:durableId="1571767000">
     <w:abstractNumId w:val="3"/>
   </w:num>
-  <w:num w:numId="7" w16cid:durableId="1168136140">
+  <w:num w:numId="7" w16cid:durableId="167255790">
     <w:abstractNumId w:val="2"/>
   </w:num>
-  <w:num w:numId="8" w16cid:durableId="870219031">
+  <w:num w:numId="8" w16cid:durableId="1543058194">
     <w:abstractNumId w:val="1"/>
   </w:num>
-  <w:num w:numId="9" w16cid:durableId="780800742">
+  <w:num w:numId="9" w16cid:durableId="373428668">
     <w:abstractNumId w:val="0"/>
   </w:num>
 </w:numbering>

</xml_diff>